<commit_message>
feat: rebuild C1123 courseware v5.0 on the house non-WSQ design
Rebuild the deck with the house non-WSQ engine (the C735 design
system) instead of patching the legacy v3 deck. Adds the full admin
opener, a core-concepts section, 60 reference diagrams re-presented as
captioned visuals, a TShark-generated Expected Evidence figure per lab,
a per-topic schedule with day dividers and break slides, and matching
images in the Learner Guide. v4.0 deliverables moved to the archive.

Co-Authored-By: Claude Opus 5.5 <noreply@anthropic.com>
</commit_message>
<xml_diff>
--- a/courseware/LG-Wireshark Network Analysis Masterclass (C1123).docx
+++ b/courseware/LG-Wireshark Network Analysis Masterclass (C1123).docx
@@ -179,7 +179,7 @@
           <w:color w:val="1F6FEB"/>
           <w:sz w:val="24"/>
         </w:rPr>
-        <w:t>Version 4.0</w:t>
+        <w:t>Version 5.0</w:t>
       </w:r>
     </w:p>
     <w:p>
@@ -341,6 +341,64 @@
           </w:p>
         </w:tc>
       </w:tr>
+      <w:tr>
+        <w:tc>
+          <w:tcPr>
+            <w:tcW w:type="dxa" w:w="2160"/>
+          </w:tcPr>
+          <w:p>
+            <w:r/>
+            <w:r>
+              <w:rPr>
+                <w:sz w:val="19"/>
+              </w:rPr>
+              <w:t>5.0</w:t>
+            </w:r>
+          </w:p>
+        </w:tc>
+        <w:tc>
+          <w:tcPr>
+            <w:tcW w:type="dxa" w:w="2160"/>
+          </w:tcPr>
+          <w:p>
+            <w:r/>
+            <w:r>
+              <w:rPr>
+                <w:sz w:val="19"/>
+              </w:rPr>
+              <w:t>5 October 2026</w:t>
+            </w:r>
+          </w:p>
+        </w:tc>
+        <w:tc>
+          <w:tcPr>
+            <w:tcW w:type="dxa" w:w="2160"/>
+          </w:tcPr>
+          <w:p>
+            <w:r/>
+            <w:r>
+              <w:rPr>
+                <w:sz w:val="19"/>
+              </w:rPr>
+              <w:t>Deck rebuilt on the house non-WSQ engine (C735 design system): full admin opener, core-concepts section, reference diagrams re-presented as captioned visuals, TShark evidence visuals per lab, per-topic schedule with day dividers and breaks.</w:t>
+            </w:r>
+          </w:p>
+        </w:tc>
+        <w:tc>
+          <w:tcPr>
+            <w:tcW w:type="dxa" w:w="2160"/>
+          </w:tcPr>
+          <w:p>
+            <w:r/>
+            <w:r>
+              <w:rPr>
+                <w:sz w:val="19"/>
+              </w:rPr>
+              <w:t>Dr. Alfred Ang</w:t>
+            </w:r>
+          </w:p>
+        </w:tc>
+      </w:tr>
     </w:tbl>
     <w:p>
       <w:r>
@@ -472,7 +530,7 @@
         </w:rPr>
         <w:t>Topic 02 — Capture Methods and Capture Filters</w:t>
         <w:tab/>
-        <w:t>7</w:t>
+        <w:t>8</w:t>
       </w:r>
     </w:p>
     <w:p>
@@ -492,7 +550,7 @@
         </w:rPr>
         <w:t>Lab 2 — Plan capture placement</w:t>
         <w:tab/>
-        <w:t>7</w:t>
+        <w:t>8</w:t>
       </w:r>
     </w:p>
     <w:p>
@@ -511,7 +569,7 @@
         </w:rPr>
         <w:t>Topic 03 — Global Preferences and Troubleshooting Profiles</w:t>
         <w:tab/>
-        <w:t>9</w:t>
+        <w:t>10</w:t>
       </w:r>
     </w:p>
     <w:p>
@@ -531,7 +589,7 @@
         </w:rPr>
         <w:t>Lab 3 — Create an analyst profile</w:t>
         <w:tab/>
-        <w:t>9</w:t>
+        <w:t>11</w:t>
       </w:r>
     </w:p>
     <w:p>
@@ -550,7 +608,7 @@
         </w:rPr>
         <w:t>Topic 04 — Navigation and Coloring Techniques</w:t>
         <w:tab/>
-        <w:t>10</w:t>
+        <w:t>12</w:t>
       </w:r>
     </w:p>
     <w:p>
@@ -570,7 +628,7 @@
         </w:rPr>
         <w:t>Lab 4 — Color and annotate evidence</w:t>
         <w:tab/>
-        <w:t>10</w:t>
+        <w:t>13</w:t>
       </w:r>
     </w:p>
     <w:p>
@@ -589,7 +647,7 @@
         </w:rPr>
         <w:t>Topic 05 — Time Values and Delay Types</w:t>
         <w:tab/>
-        <w:t>11</w:t>
+        <w:t>15</w:t>
       </w:r>
     </w:p>
     <w:p>
@@ -609,7 +667,7 @@
         </w:rPr>
         <w:t>Lab 5 — Separate path and server delay</w:t>
         <w:tab/>
-        <w:t>12</w:t>
+        <w:t>15</w:t>
       </w:r>
     </w:p>
     <w:p>
@@ -628,7 +686,7 @@
         </w:rPr>
         <w:t>Topic 06 — Trace Statistics and VoIP Overview</w:t>
         <w:tab/>
-        <w:t>13</w:t>
+        <w:t>17</w:t>
       </w:r>
     </w:p>
     <w:p>
@@ -648,7 +706,7 @@
         </w:rPr>
         <w:t>Lab 6 — Summarize traffic and a voice stream</w:t>
         <w:tab/>
-        <w:t>13</w:t>
+        <w:t>17</w:t>
       </w:r>
     </w:p>
     <w:p>
@@ -667,7 +725,7 @@
         </w:rPr>
         <w:t>Topic 07 — Display Filters</w:t>
         <w:tab/>
-        <w:t>15</w:t>
+        <w:t>19</w:t>
       </w:r>
     </w:p>
     <w:p>
@@ -687,7 +745,7 @@
         </w:rPr>
         <w:t>Lab 7 — Build a filter evidence matrix</w:t>
         <w:tab/>
-        <w:t>15</w:t>
+        <w:t>19</w:t>
       </w:r>
     </w:p>
     <w:p>
@@ -706,7 +764,7 @@
         </w:rPr>
         <w:t>Topic 08 — TCP/IP Communications and Resolution</w:t>
         <w:tab/>
-        <w:t>16</w:t>
+        <w:t>21</w:t>
       </w:r>
     </w:p>
     <w:p>
@@ -726,7 +784,7 @@
         </w:rPr>
         <w:t>Lab 8 — Reconstruct an application dependency chain</w:t>
         <w:tab/>
-        <w:t>16</w:t>
+        <w:t>21</w:t>
       </w:r>
     </w:p>
     <w:p>
@@ -745,7 +803,7 @@
         </w:rPr>
         <w:t>Topic 09 — DNS Traffic Analysis</w:t>
         <w:tab/>
-        <w:t>17</w:t>
+        <w:t>23</w:t>
       </w:r>
     </w:p>
     <w:p>
@@ -765,7 +823,7 @@
         </w:rPr>
         <w:t>Lab 9 — Diagnose DNS failure and delay</w:t>
         <w:tab/>
-        <w:t>18</w:t>
+        <w:t>23</w:t>
       </w:r>
     </w:p>
     <w:p>
@@ -784,7 +842,7 @@
         </w:rPr>
         <w:t>Topic 10 — ARP Traffic Analysis</w:t>
         <w:tab/>
-        <w:t>19</w:t>
+        <w:t>25</w:t>
       </w:r>
     </w:p>
     <w:p>
@@ -804,7 +862,7 @@
         </w:rPr>
         <w:t>Lab 10 — Verify link-local resolution</w:t>
         <w:tab/>
-        <w:t>19</w:t>
+        <w:t>25</w:t>
       </w:r>
     </w:p>
     <w:p>
@@ -823,7 +881,7 @@
         </w:rPr>
         <w:t>Topic 11 — IPv4 Traffic Analysis</w:t>
         <w:tab/>
-        <w:t>20</w:t>
+        <w:t>26</w:t>
       </w:r>
     </w:p>
     <w:p>
@@ -843,7 +901,7 @@
         </w:rPr>
         <w:t>Lab 11 — Classify IPv4 scope and headers</w:t>
         <w:tab/>
-        <w:t>20</w:t>
+        <w:t>27</w:t>
       </w:r>
     </w:p>
     <w:p>
@@ -862,7 +920,7 @@
         </w:rPr>
         <w:t>Topic 12 — ICMP Traffic Analysis</w:t>
         <w:tab/>
-        <w:t>22</w:t>
+        <w:t>28</w:t>
       </w:r>
     </w:p>
     <w:p>
@@ -882,7 +940,7 @@
         </w:rPr>
         <w:t>Lab 12 — Interpret echo and unreachable messages</w:t>
         <w:tab/>
-        <w:t>22</w:t>
+        <w:t>28</w:t>
       </w:r>
     </w:p>
     <w:p>
@@ -901,7 +959,7 @@
         </w:rPr>
         <w:t>Topic 13 — UDP Traffic Analysis</w:t>
         <w:tab/>
-        <w:t>23</w:t>
+        <w:t>30</w:t>
       </w:r>
     </w:p>
     <w:p>
@@ -921,7 +979,7 @@
         </w:rPr>
         <w:t>Lab 13 — Follow datagrams and service refusal</w:t>
         <w:tab/>
-        <w:t>23</w:t>
+        <w:t>30</w:t>
       </w:r>
     </w:p>
     <w:p>
@@ -940,7 +998,7 @@
         </w:rPr>
         <w:t>Topic 14 — TCP Protocol Analysis</w:t>
         <w:tab/>
-        <w:t>25</w:t>
+        <w:t>32</w:t>
       </w:r>
     </w:p>
     <w:p>
@@ -960,7 +1018,7 @@
         </w:rPr>
         <w:t>Lab 14 — Investigate retransmission and zero window</w:t>
         <w:tab/>
-        <w:t>25</w:t>
+        <w:t>32</w:t>
       </w:r>
     </w:p>
     <w:p>
@@ -979,7 +1037,7 @@
         </w:rPr>
         <w:t>Topic 15 — Traffic Graphs</w:t>
         <w:tab/>
-        <w:t>26</w:t>
+        <w:t>34</w:t>
       </w:r>
     </w:p>
     <w:p>
@@ -999,7 +1057,7 @@
         </w:rPr>
         <w:t>Lab 15 — Graph bytes, RTT and recovery</w:t>
         <w:tab/>
-        <w:t>26</w:t>
+        <w:t>34</w:t>
       </w:r>
     </w:p>
     <w:p>
@@ -1018,7 +1076,7 @@
         </w:rPr>
         <w:t>Topic 16 — HTTP and HTTP/2 Analysis</w:t>
         <w:tab/>
-        <w:t>28</w:t>
+        <w:t>36</w:t>
       </w:r>
     </w:p>
     <w:p>
@@ -1038,7 +1096,7 @@
         </w:rPr>
         <w:t>Lab 16 — Inspect HTTP outcomes and HTTP/2 frames</w:t>
         <w:tab/>
-        <w:t>28</w:t>
+        <w:t>37</w:t>
       </w:r>
     </w:p>
     <w:p>
@@ -1057,7 +1115,7 @@
         </w:rPr>
         <w:t>Topic 17 — TLS-Encrypted Traffic Analysis</w:t>
         <w:tab/>
-        <w:t>29</w:t>
+        <w:t>39</w:t>
       </w:r>
     </w:p>
     <w:p>
@@ -1077,7 +1135,7 @@
         </w:rPr>
         <w:t>Lab 17 — Compare encrypted and decrypted views</w:t>
         <w:tab/>
-        <w:t>29</w:t>
+        <w:t>39</w:t>
       </w:r>
     </w:p>
     <w:p>
@@ -1096,7 +1154,7 @@
         </w:rPr>
         <w:t>Topic 18 — Ten Troubleshooting Steps and Reporting</w:t>
         <w:tab/>
-        <w:t>31</w:t>
+        <w:t>41</w:t>
       </w:r>
     </w:p>
     <w:p>
@@ -1116,7 +1174,7 @@
         </w:rPr>
         <w:t>Lab 18 — Produce an evidence-led incident report</w:t>
         <w:tab/>
-        <w:t>31</w:t>
+        <w:t>41</w:t>
       </w:r>
     </w:p>
     <w:p>
@@ -1135,7 +1193,7 @@
         </w:rPr>
         <w:t>Next Steps</w:t>
         <w:tab/>
-        <w:t>32</w:t>
+        <w:t>43</w:t>
       </w:r>
     </w:p>
     <w:p>
@@ -1154,7 +1212,7 @@
         </w:rPr>
         <w:t>Glossary</w:t>
         <w:tab/>
-        <w:t>32</w:t>
+        <w:t>43</w:t>
       </w:r>
     </w:p>
     <w:p>
@@ -1190,7 +1248,7 @@
         <w:rPr>
           <w:b w:val="0"/>
         </w:rPr>
-        <w:t>The revised v4.0 deck starts from the supplied v3 reference presentation. Current lab instructions, data and scripts are supplied here; the legacy external trace names are not required for the new activities.</w:t>
+        <w:t>Version 5.0 aligns the slides, this guide and the lesson plan with the Tertiary Infotech house design. Every lab ships with its own synthetic capture, templates and verification script; the Expected Evidence figure in each lab shows the packet list you should reproduce.</w:t>
       </w:r>
     </w:p>
     <w:p>
@@ -1437,6 +1495,58 @@
     </w:p>
     <w:p>
       <w:pPr>
+        <w:jc w:val="center"/>
+      </w:pPr>
+      <w:r>
+        <w:drawing>
+          <wp:inline xmlns:a="http://schemas.openxmlformats.org/drawingml/2006/main" xmlns:pic="http://schemas.openxmlformats.org/drawingml/2006/picture">
+            <wp:extent cx="5665786" cy="3840479"/>
+            <wp:docPr id="2" name="Picture 2"/>
+            <wp:cNvGraphicFramePr>
+              <a:graphicFrameLocks noChangeAspect="1"/>
+            </wp:cNvGraphicFramePr>
+            <a:graphic>
+              <a:graphicData uri="http://schemas.openxmlformats.org/drawingml/2006/picture">
+                <pic:pic>
+                  <pic:nvPicPr>
+                    <pic:cNvPr id="0" name="ref-020.png"/>
+                    <pic:cNvPicPr/>
+                  </pic:nvPicPr>
+                  <pic:blipFill>
+                    <a:blip r:embed="rId10"/>
+                    <a:stretch>
+                      <a:fillRect/>
+                    </a:stretch>
+                  </pic:blipFill>
+                  <pic:spPr>
+                    <a:xfrm>
+                      <a:off x="0" y="0"/>
+                      <a:ext cx="5665786" cy="3840479"/>
+                    </a:xfrm>
+                    <a:prstGeom prst="rect"/>
+                  </pic:spPr>
+                </pic:pic>
+              </a:graphicData>
+            </a:graphic>
+          </wp:inline>
+        </w:drawing>
+      </w:r>
+    </w:p>
+    <w:p>
+      <w:pPr>
+        <w:jc w:val="center"/>
+      </w:pPr>
+      <w:r>
+        <w:rPr>
+          <w:i/>
+          <w:color w:val="555B66"/>
+          <w:sz w:val="18"/>
+        </w:rPr>
+        <w:t>The TCP/IP and OSI Models — OSI layers mapped to the TCP/IP model</w:t>
+      </w:r>
+    </w:p>
+    <w:p>
+      <w:pPr>
         <w:pStyle w:val="Heading2"/>
         <w:keepNext/>
       </w:pPr>
@@ -1636,6 +1746,58 @@
       </w:r>
     </w:p>
     <w:p>
+      <w:pPr>
+        <w:jc w:val="center"/>
+      </w:pPr>
+      <w:r>
+        <w:drawing>
+          <wp:inline xmlns:a="http://schemas.openxmlformats.org/drawingml/2006/main" xmlns:pic="http://schemas.openxmlformats.org/drawingml/2006/picture">
+            <wp:extent cx="5760720" cy="779392"/>
+            <wp:docPr id="3" name="Picture 3"/>
+            <wp:cNvGraphicFramePr>
+              <a:graphicFrameLocks noChangeAspect="1"/>
+            </wp:cNvGraphicFramePr>
+            <a:graphic>
+              <a:graphicData uri="http://schemas.openxmlformats.org/drawingml/2006/picture">
+                <pic:pic>
+                  <pic:nvPicPr>
+                    <pic:cNvPr id="0" name="lab-01-evidence.png"/>
+                    <pic:cNvPicPr/>
+                  </pic:nvPicPr>
+                  <pic:blipFill>
+                    <a:blip r:embed="rId11"/>
+                    <a:stretch>
+                      <a:fillRect/>
+                    </a:stretch>
+                  </pic:blipFill>
+                  <pic:spPr>
+                    <a:xfrm>
+                      <a:off x="0" y="0"/>
+                      <a:ext cx="5760720" cy="779392"/>
+                    </a:xfrm>
+                    <a:prstGeom prst="rect"/>
+                  </pic:spPr>
+                </pic:pic>
+              </a:graphicData>
+            </a:graphic>
+          </wp:inline>
+        </w:drawing>
+      </w:r>
+    </w:p>
+    <w:p>
+      <w:pPr>
+        <w:jc w:val="center"/>
+      </w:pPr>
+      <w:r>
+        <w:rPr>
+          <w:i/>
+          <w:color w:val="555B66"/>
+          <w:sz w:val="18"/>
+        </w:rPr>
+        <w:t>Lab 1 expected evidence — the packet list your filter should produce</w:t>
+      </w:r>
+    </w:p>
+    <w:p>
       <w:r>
         <w:rPr>
           <w:b/>
@@ -1767,6 +1929,58 @@
       </w:pPr>
       <w:r>
         <w:t>Bound file size and duration; check capture drops before attributing missing packets to network loss.</w:t>
+      </w:r>
+    </w:p>
+    <w:p>
+      <w:pPr>
+        <w:jc w:val="center"/>
+      </w:pPr>
+      <w:r>
+        <w:drawing>
+          <wp:inline xmlns:a="http://schemas.openxmlformats.org/drawingml/2006/main" xmlns:pic="http://schemas.openxmlformats.org/drawingml/2006/picture">
+            <wp:extent cx="5760720" cy="3214356"/>
+            <wp:docPr id="4" name="Picture 4"/>
+            <wp:cNvGraphicFramePr>
+              <a:graphicFrameLocks noChangeAspect="1"/>
+            </wp:cNvGraphicFramePr>
+            <a:graphic>
+              <a:graphicData uri="http://schemas.openxmlformats.org/drawingml/2006/picture">
+                <pic:pic>
+                  <pic:nvPicPr>
+                    <pic:cNvPr id="0" name="ref-065.png"/>
+                    <pic:cNvPicPr/>
+                  </pic:nvPicPr>
+                  <pic:blipFill>
+                    <a:blip r:embed="rId12"/>
+                    <a:stretch>
+                      <a:fillRect/>
+                    </a:stretch>
+                  </pic:blipFill>
+                  <pic:spPr>
+                    <a:xfrm>
+                      <a:off x="0" y="0"/>
+                      <a:ext cx="5760720" cy="3214356"/>
+                    </a:xfrm>
+                    <a:prstGeom prst="rect"/>
+                  </pic:spPr>
+                </pic:pic>
+              </a:graphicData>
+            </a:graphic>
+          </wp:inline>
+        </w:drawing>
+      </w:r>
+    </w:p>
+    <w:p>
+      <w:pPr>
+        <w:jc w:val="center"/>
+      </w:pPr>
+      <w:r>
+        <w:rPr>
+          <w:i/>
+          <w:color w:val="555B66"/>
+          <w:sz w:val="18"/>
+        </w:rPr>
+        <w:t>Where to Tap Into the Network — Choose the observation point before you capture</w:t>
       </w:r>
     </w:p>
     <w:p>
@@ -1987,6 +2201,58 @@
       </w:r>
     </w:p>
     <w:p>
+      <w:pPr>
+        <w:jc w:val="center"/>
+      </w:pPr>
+      <w:r>
+        <w:drawing>
+          <wp:inline xmlns:a="http://schemas.openxmlformats.org/drawingml/2006/main" xmlns:pic="http://schemas.openxmlformats.org/drawingml/2006/picture">
+            <wp:extent cx="5760720" cy="1999309"/>
+            <wp:docPr id="5" name="Picture 5"/>
+            <wp:cNvGraphicFramePr>
+              <a:graphicFrameLocks noChangeAspect="1"/>
+            </wp:cNvGraphicFramePr>
+            <a:graphic>
+              <a:graphicData uri="http://schemas.openxmlformats.org/drawingml/2006/picture">
+                <pic:pic>
+                  <pic:nvPicPr>
+                    <pic:cNvPr id="0" name="lab-02-evidence.png"/>
+                    <pic:cNvPicPr/>
+                  </pic:nvPicPr>
+                  <pic:blipFill>
+                    <a:blip r:embed="rId13"/>
+                    <a:stretch>
+                      <a:fillRect/>
+                    </a:stretch>
+                  </pic:blipFill>
+                  <pic:spPr>
+                    <a:xfrm>
+                      <a:off x="0" y="0"/>
+                      <a:ext cx="5760720" cy="1999309"/>
+                    </a:xfrm>
+                    <a:prstGeom prst="rect"/>
+                  </pic:spPr>
+                </pic:pic>
+              </a:graphicData>
+            </a:graphic>
+          </wp:inline>
+        </w:drawing>
+      </w:r>
+    </w:p>
+    <w:p>
+      <w:pPr>
+        <w:jc w:val="center"/>
+      </w:pPr>
+      <w:r>
+        <w:rPr>
+          <w:i/>
+          <w:color w:val="555B66"/>
+          <w:sz w:val="18"/>
+        </w:rPr>
+        <w:t>Lab 2 expected evidence — the packet list your filter should produce</w:t>
+      </w:r>
+    </w:p>
+    <w:p>
       <w:r>
         <w:rPr>
           <w:b/>
@@ -2118,6 +2384,58 @@
       </w:pPr>
       <w:r>
         <w:t>Protocol heuristics and TCP analysis preferences change interpretation, not the stored bytes.</w:t>
+      </w:r>
+    </w:p>
+    <w:p>
+      <w:pPr>
+        <w:jc w:val="center"/>
+      </w:pPr>
+      <w:r>
+        <w:drawing>
+          <wp:inline xmlns:a="http://schemas.openxmlformats.org/drawingml/2006/main" xmlns:pic="http://schemas.openxmlformats.org/drawingml/2006/picture">
+            <wp:extent cx="5760720" cy="2578361"/>
+            <wp:docPr id="6" name="Picture 6"/>
+            <wp:cNvGraphicFramePr>
+              <a:graphicFrameLocks noChangeAspect="1"/>
+            </wp:cNvGraphicFramePr>
+            <a:graphic>
+              <a:graphicData uri="http://schemas.openxmlformats.org/drawingml/2006/picture">
+                <pic:pic>
+                  <pic:nvPicPr>
+                    <pic:cNvPr id="0" name="ref-048.png"/>
+                    <pic:cNvPicPr/>
+                  </pic:nvPicPr>
+                  <pic:blipFill>
+                    <a:blip r:embed="rId14"/>
+                    <a:stretch>
+                      <a:fillRect/>
+                    </a:stretch>
+                  </pic:blipFill>
+                  <pic:spPr>
+                    <a:xfrm>
+                      <a:off x="0" y="0"/>
+                      <a:ext cx="5760720" cy="2578361"/>
+                    </a:xfrm>
+                    <a:prstGeom prst="rect"/>
+                  </pic:spPr>
+                </pic:pic>
+              </a:graphicData>
+            </a:graphic>
+          </wp:inline>
+        </w:drawing>
+      </w:r>
+    </w:p>
+    <w:p>
+      <w:pPr>
+        <w:jc w:val="center"/>
+      </w:pPr>
+      <w:r>
+        <w:rPr>
+          <w:i/>
+          <w:color w:val="555B66"/>
+          <w:sz w:val="18"/>
+        </w:rPr>
+        <w:t>Configuration Profiles — Right-click the Profile area in the status bar to switch or create</w:t>
       </w:r>
     </w:p>
     <w:p>
@@ -2338,6 +2656,58 @@
       </w:r>
     </w:p>
     <w:p>
+      <w:pPr>
+        <w:jc w:val="center"/>
+      </w:pPr>
+      <w:r>
+        <w:drawing>
+          <wp:inline xmlns:a="http://schemas.openxmlformats.org/drawingml/2006/main" xmlns:pic="http://schemas.openxmlformats.org/drawingml/2006/picture">
+            <wp:extent cx="5760720" cy="1321577"/>
+            <wp:docPr id="7" name="Picture 7"/>
+            <wp:cNvGraphicFramePr>
+              <a:graphicFrameLocks noChangeAspect="1"/>
+            </wp:cNvGraphicFramePr>
+            <a:graphic>
+              <a:graphicData uri="http://schemas.openxmlformats.org/drawingml/2006/picture">
+                <pic:pic>
+                  <pic:nvPicPr>
+                    <pic:cNvPr id="0" name="lab-03-evidence.png"/>
+                    <pic:cNvPicPr/>
+                  </pic:nvPicPr>
+                  <pic:blipFill>
+                    <a:blip r:embed="rId15"/>
+                    <a:stretch>
+                      <a:fillRect/>
+                    </a:stretch>
+                  </pic:blipFill>
+                  <pic:spPr>
+                    <a:xfrm>
+                      <a:off x="0" y="0"/>
+                      <a:ext cx="5760720" cy="1321577"/>
+                    </a:xfrm>
+                    <a:prstGeom prst="rect"/>
+                  </pic:spPr>
+                </pic:pic>
+              </a:graphicData>
+            </a:graphic>
+          </wp:inline>
+        </w:drawing>
+      </w:r>
+    </w:p>
+    <w:p>
+      <w:pPr>
+        <w:jc w:val="center"/>
+      </w:pPr>
+      <w:r>
+        <w:rPr>
+          <w:i/>
+          <w:color w:val="555B66"/>
+          <w:sz w:val="18"/>
+        </w:rPr>
+        <w:t>Lab 3 expected evidence — the packet list your filter should produce</w:t>
+      </w:r>
+    </w:p>
+    <w:p>
       <w:r>
         <w:rPr>
           <w:b/>
@@ -2469,6 +2839,58 @@
       </w:pPr>
       <w:r>
         <w:t>Bookmarks and comments preserve the analyst path without changing the captured payload.</w:t>
+      </w:r>
+    </w:p>
+    <w:p>
+      <w:pPr>
+        <w:jc w:val="center"/>
+      </w:pPr>
+      <w:r>
+        <w:drawing>
+          <wp:inline xmlns:a="http://schemas.openxmlformats.org/drawingml/2006/main" xmlns:pic="http://schemas.openxmlformats.org/drawingml/2006/picture">
+            <wp:extent cx="5359943" cy="3840479"/>
+            <wp:docPr id="8" name="Picture 8"/>
+            <wp:cNvGraphicFramePr>
+              <a:graphicFrameLocks noChangeAspect="1"/>
+            </wp:cNvGraphicFramePr>
+            <a:graphic>
+              <a:graphicData uri="http://schemas.openxmlformats.org/drawingml/2006/picture">
+                <pic:pic>
+                  <pic:nvPicPr>
+                    <pic:cNvPr id="0" name="ref-115.png"/>
+                    <pic:cNvPicPr/>
+                  </pic:nvPicPr>
+                  <pic:blipFill>
+                    <a:blip r:embed="rId16"/>
+                    <a:stretch>
+                      <a:fillRect/>
+                    </a:stretch>
+                  </pic:blipFill>
+                  <pic:spPr>
+                    <a:xfrm>
+                      <a:off x="0" y="0"/>
+                      <a:ext cx="5359943" cy="3840479"/>
+                    </a:xfrm>
+                    <a:prstGeom prst="rect"/>
+                  </pic:spPr>
+                </pic:pic>
+              </a:graphicData>
+            </a:graphic>
+          </wp:inline>
+        </w:drawing>
+      </w:r>
+    </w:p>
+    <w:p>
+      <w:pPr>
+        <w:jc w:val="center"/>
+      </w:pPr>
+      <w:r>
+        <w:rPr>
+          <w:i/>
+          <w:color w:val="555B66"/>
+          <w:sz w:val="18"/>
+        </w:rPr>
+        <w:t>Colouring Rules — The coloring rules list is processed in order</w:t>
       </w:r>
     </w:p>
     <w:p>
@@ -2689,6 +3111,58 @@
       </w:r>
     </w:p>
     <w:p>
+      <w:pPr>
+        <w:jc w:val="center"/>
+      </w:pPr>
+      <w:r>
+        <w:drawing>
+          <wp:inline xmlns:a="http://schemas.openxmlformats.org/drawingml/2006/main" xmlns:pic="http://schemas.openxmlformats.org/drawingml/2006/picture">
+            <wp:extent cx="5760720" cy="779392"/>
+            <wp:docPr id="9" name="Picture 9"/>
+            <wp:cNvGraphicFramePr>
+              <a:graphicFrameLocks noChangeAspect="1"/>
+            </wp:cNvGraphicFramePr>
+            <a:graphic>
+              <a:graphicData uri="http://schemas.openxmlformats.org/drawingml/2006/picture">
+                <pic:pic>
+                  <pic:nvPicPr>
+                    <pic:cNvPr id="0" name="lab-04-evidence.png"/>
+                    <pic:cNvPicPr/>
+                  </pic:nvPicPr>
+                  <pic:blipFill>
+                    <a:blip r:embed="rId17"/>
+                    <a:stretch>
+                      <a:fillRect/>
+                    </a:stretch>
+                  </pic:blipFill>
+                  <pic:spPr>
+                    <a:xfrm>
+                      <a:off x="0" y="0"/>
+                      <a:ext cx="5760720" cy="779392"/>
+                    </a:xfrm>
+                    <a:prstGeom prst="rect"/>
+                  </pic:spPr>
+                </pic:pic>
+              </a:graphicData>
+            </a:graphic>
+          </wp:inline>
+        </w:drawing>
+      </w:r>
+    </w:p>
+    <w:p>
+      <w:pPr>
+        <w:jc w:val="center"/>
+      </w:pPr>
+      <w:r>
+        <w:rPr>
+          <w:i/>
+          <w:color w:val="555B66"/>
+          <w:sz w:val="18"/>
+        </w:rPr>
+        <w:t>Lab 4 expected evidence — the packet list your filter should produce</w:t>
+      </w:r>
+    </w:p>
+    <w:p>
       <w:r>
         <w:rPr>
           <w:b/>
@@ -2820,6 +3294,58 @@
       </w:pPr>
       <w:r>
         <w:t>One-sided timestamps cannot identify exactly which intermediate device delayed or dropped a packet.</w:t>
+      </w:r>
+    </w:p>
+    <w:p>
+      <w:pPr>
+        <w:jc w:val="center"/>
+      </w:pPr>
+      <w:r>
+        <w:drawing>
+          <wp:inline xmlns:a="http://schemas.openxmlformats.org/drawingml/2006/main" xmlns:pic="http://schemas.openxmlformats.org/drawingml/2006/picture">
+            <wp:extent cx="5760720" cy="2803725"/>
+            <wp:docPr id="10" name="Picture 10"/>
+            <wp:cNvGraphicFramePr>
+              <a:graphicFrameLocks noChangeAspect="1"/>
+            </wp:cNvGraphicFramePr>
+            <a:graphic>
+              <a:graphicData uri="http://schemas.openxmlformats.org/drawingml/2006/picture">
+                <pic:pic>
+                  <pic:nvPicPr>
+                    <pic:cNvPr id="0" name="ref-181.png"/>
+                    <pic:cNvPicPr/>
+                  </pic:nvPicPr>
+                  <pic:blipFill>
+                    <a:blip r:embed="rId18"/>
+                    <a:stretch>
+                      <a:fillRect/>
+                    </a:stretch>
+                  </pic:blipFill>
+                  <pic:spPr>
+                    <a:xfrm>
+                      <a:off x="0" y="0"/>
+                      <a:ext cx="5760720" cy="2803725"/>
+                    </a:xfrm>
+                    <a:prstGeom prst="rect"/>
+                  </pic:spPr>
+                </pic:pic>
+              </a:graphicData>
+            </a:graphic>
+          </wp:inline>
+        </w:drawing>
+      </w:r>
+    </w:p>
+    <w:p>
+      <w:pPr>
+        <w:jc w:val="center"/>
+      </w:pPr>
+      <w:r>
+        <w:rPr>
+          <w:i/>
+          <w:color w:val="555B66"/>
+          <w:sz w:val="18"/>
+        </w:rPr>
+        <w:t>Time Display Formats — Precision depends on the capture hardware and file format</w:t>
       </w:r>
     </w:p>
     <w:p>
@@ -3040,6 +3566,58 @@
       </w:r>
     </w:p>
     <w:p>
+      <w:pPr>
+        <w:jc w:val="center"/>
+      </w:pPr>
+      <w:r>
+        <w:drawing>
+          <wp:inline xmlns:a="http://schemas.openxmlformats.org/drawingml/2006/main" xmlns:pic="http://schemas.openxmlformats.org/drawingml/2006/picture">
+            <wp:extent cx="5760720" cy="914938"/>
+            <wp:docPr id="11" name="Picture 11"/>
+            <wp:cNvGraphicFramePr>
+              <a:graphicFrameLocks noChangeAspect="1"/>
+            </wp:cNvGraphicFramePr>
+            <a:graphic>
+              <a:graphicData uri="http://schemas.openxmlformats.org/drawingml/2006/picture">
+                <pic:pic>
+                  <pic:nvPicPr>
+                    <pic:cNvPr id="0" name="lab-05-evidence.png"/>
+                    <pic:cNvPicPr/>
+                  </pic:nvPicPr>
+                  <pic:blipFill>
+                    <a:blip r:embed="rId19"/>
+                    <a:stretch>
+                      <a:fillRect/>
+                    </a:stretch>
+                  </pic:blipFill>
+                  <pic:spPr>
+                    <a:xfrm>
+                      <a:off x="0" y="0"/>
+                      <a:ext cx="5760720" cy="914938"/>
+                    </a:xfrm>
+                    <a:prstGeom prst="rect"/>
+                  </pic:spPr>
+                </pic:pic>
+              </a:graphicData>
+            </a:graphic>
+          </wp:inline>
+        </w:drawing>
+      </w:r>
+    </w:p>
+    <w:p>
+      <w:pPr>
+        <w:jc w:val="center"/>
+      </w:pPr>
+      <w:r>
+        <w:rPr>
+          <w:i/>
+          <w:color w:val="555B66"/>
+          <w:sz w:val="18"/>
+        </w:rPr>
+        <w:t>Lab 5 expected evidence — the packet list your filter should produce</w:t>
+      </w:r>
+    </w:p>
+    <w:p>
       <w:r>
         <w:rPr>
           <w:b/>
@@ -3171,6 +3749,58 @@
       </w:pPr>
       <w:r>
         <w:t>SIP signals a call while RTP carries media; jitter, loss and codec interpretation need stream context.</w:t>
+      </w:r>
+    </w:p>
+    <w:p>
+      <w:pPr>
+        <w:jc w:val="center"/>
+      </w:pPr>
+      <w:r>
+        <w:drawing>
+          <wp:inline xmlns:a="http://schemas.openxmlformats.org/drawingml/2006/main" xmlns:pic="http://schemas.openxmlformats.org/drawingml/2006/picture">
+            <wp:extent cx="5760720" cy="2788294"/>
+            <wp:docPr id="12" name="Picture 12"/>
+            <wp:cNvGraphicFramePr>
+              <a:graphicFrameLocks noChangeAspect="1"/>
+            </wp:cNvGraphicFramePr>
+            <a:graphic>
+              <a:graphicData uri="http://schemas.openxmlformats.org/drawingml/2006/picture">
+                <pic:pic>
+                  <pic:nvPicPr>
+                    <pic:cNvPr id="0" name="ref-209.png"/>
+                    <pic:cNvPicPr/>
+                  </pic:nvPicPr>
+                  <pic:blipFill>
+                    <a:blip r:embed="rId20"/>
+                    <a:stretch>
+                      <a:fillRect/>
+                    </a:stretch>
+                  </pic:blipFill>
+                  <pic:spPr>
+                    <a:xfrm>
+                      <a:off x="0" y="0"/>
+                      <a:ext cx="5760720" cy="2788294"/>
+                    </a:xfrm>
+                    <a:prstGeom prst="rect"/>
+                  </pic:spPr>
+                </pic:pic>
+              </a:graphicData>
+            </a:graphic>
+          </wp:inline>
+        </w:drawing>
+      </w:r>
+    </w:p>
+    <w:p>
+      <w:pPr>
+        <w:jc w:val="center"/>
+      </w:pPr>
+      <w:r>
+        <w:rPr>
+          <w:i/>
+          <w:color w:val="555B66"/>
+          <w:sz w:val="18"/>
+        </w:rPr>
+        <w:t>Capture File Properties — Statistics | Protocol Hierarchy shows the protocol mix</w:t>
       </w:r>
     </w:p>
     <w:p>
@@ -3391,6 +4021,58 @@
       </w:r>
     </w:p>
     <w:p>
+      <w:pPr>
+        <w:jc w:val="center"/>
+      </w:pPr>
+      <w:r>
+        <w:drawing>
+          <wp:inline xmlns:a="http://schemas.openxmlformats.org/drawingml/2006/main" xmlns:pic="http://schemas.openxmlformats.org/drawingml/2006/picture">
+            <wp:extent cx="5760720" cy="779392"/>
+            <wp:docPr id="13" name="Picture 13"/>
+            <wp:cNvGraphicFramePr>
+              <a:graphicFrameLocks noChangeAspect="1"/>
+            </wp:cNvGraphicFramePr>
+            <a:graphic>
+              <a:graphicData uri="http://schemas.openxmlformats.org/drawingml/2006/picture">
+                <pic:pic>
+                  <pic:nvPicPr>
+                    <pic:cNvPr id="0" name="lab-06-evidence.png"/>
+                    <pic:cNvPicPr/>
+                  </pic:nvPicPr>
+                  <pic:blipFill>
+                    <a:blip r:embed="rId21"/>
+                    <a:stretch>
+                      <a:fillRect/>
+                    </a:stretch>
+                  </pic:blipFill>
+                  <pic:spPr>
+                    <a:xfrm>
+                      <a:off x="0" y="0"/>
+                      <a:ext cx="5760720" cy="779392"/>
+                    </a:xfrm>
+                    <a:prstGeom prst="rect"/>
+                  </pic:spPr>
+                </pic:pic>
+              </a:graphicData>
+            </a:graphic>
+          </wp:inline>
+        </w:drawing>
+      </w:r>
+    </w:p>
+    <w:p>
+      <w:pPr>
+        <w:jc w:val="center"/>
+      </w:pPr>
+      <w:r>
+        <w:rPr>
+          <w:i/>
+          <w:color w:val="555B66"/>
+          <w:sz w:val="18"/>
+        </w:rPr>
+        <w:t>Lab 6 expected evidence — the packet list your filter should produce</w:t>
+      </w:r>
+    </w:p>
+    <w:p>
       <w:r>
         <w:rPr>
           <w:b/>
@@ -3522,6 +4204,58 @@
       </w:pPr>
       <w:r>
         <w:t>Since Wireshark 3.6, != uses all-not-equal semantics; historical slides describing any-not-equal are obsolete.</w:t>
+      </w:r>
+    </w:p>
+    <w:p>
+      <w:pPr>
+        <w:jc w:val="center"/>
+      </w:pPr>
+      <w:r>
+        <w:drawing>
+          <wp:inline xmlns:a="http://schemas.openxmlformats.org/drawingml/2006/main" xmlns:pic="http://schemas.openxmlformats.org/drawingml/2006/picture">
+            <wp:extent cx="5760720" cy="3099475"/>
+            <wp:docPr id="14" name="Picture 14"/>
+            <wp:cNvGraphicFramePr>
+              <a:graphicFrameLocks noChangeAspect="1"/>
+            </wp:cNvGraphicFramePr>
+            <a:graphic>
+              <a:graphicData uri="http://schemas.openxmlformats.org/drawingml/2006/picture">
+                <pic:pic>
+                  <pic:nvPicPr>
+                    <pic:cNvPr id="0" name="ref-088.png"/>
+                    <pic:cNvPicPr/>
+                  </pic:nvPicPr>
+                  <pic:blipFill>
+                    <a:blip r:embed="rId22"/>
+                    <a:stretch>
+                      <a:fillRect/>
+                    </a:stretch>
+                  </pic:blipFill>
+                  <pic:spPr>
+                    <a:xfrm>
+                      <a:off x="0" y="0"/>
+                      <a:ext cx="5760720" cy="3099475"/>
+                    </a:xfrm>
+                    <a:prstGeom prst="rect"/>
+                  </pic:spPr>
+                </pic:pic>
+              </a:graphicData>
+            </a:graphic>
+          </wp:inline>
+        </w:drawing>
+      </w:r>
+    </w:p>
+    <w:p>
+      <w:pPr>
+        <w:jc w:val="center"/>
+      </w:pPr>
+      <w:r>
+        <w:rPr>
+          <w:i/>
+          <w:color w:val="555B66"/>
+          <w:sz w:val="18"/>
+        </w:rPr>
+        <w:t>Display Filter Operators — Comparison operators with C-like and English forms</w:t>
       </w:r>
     </w:p>
     <w:p>
@@ -3742,6 +4476,58 @@
       </w:r>
     </w:p>
     <w:p>
+      <w:pPr>
+        <w:jc w:val="center"/>
+      </w:pPr>
+      <w:r>
+        <w:drawing>
+          <wp:inline xmlns:a="http://schemas.openxmlformats.org/drawingml/2006/main" xmlns:pic="http://schemas.openxmlformats.org/drawingml/2006/picture">
+            <wp:extent cx="5760720" cy="643845"/>
+            <wp:docPr id="15" name="Picture 15"/>
+            <wp:cNvGraphicFramePr>
+              <a:graphicFrameLocks noChangeAspect="1"/>
+            </wp:cNvGraphicFramePr>
+            <a:graphic>
+              <a:graphicData uri="http://schemas.openxmlformats.org/drawingml/2006/picture">
+                <pic:pic>
+                  <pic:nvPicPr>
+                    <pic:cNvPr id="0" name="lab-07-evidence.png"/>
+                    <pic:cNvPicPr/>
+                  </pic:nvPicPr>
+                  <pic:blipFill>
+                    <a:blip r:embed="rId23"/>
+                    <a:stretch>
+                      <a:fillRect/>
+                    </a:stretch>
+                  </pic:blipFill>
+                  <pic:spPr>
+                    <a:xfrm>
+                      <a:off x="0" y="0"/>
+                      <a:ext cx="5760720" cy="643845"/>
+                    </a:xfrm>
+                    <a:prstGeom prst="rect"/>
+                  </pic:spPr>
+                </pic:pic>
+              </a:graphicData>
+            </a:graphic>
+          </wp:inline>
+        </w:drawing>
+      </w:r>
+    </w:p>
+    <w:p>
+      <w:pPr>
+        <w:jc w:val="center"/>
+      </w:pPr>
+      <w:r>
+        <w:rPr>
+          <w:i/>
+          <w:color w:val="555B66"/>
+          <w:sz w:val="18"/>
+        </w:rPr>
+        <w:t>Lab 7 expected evidence — the packet list your filter should produce</w:t>
+      </w:r>
+    </w:p>
+    <w:p>
       <w:r>
         <w:rPr>
           <w:b/>
@@ -3873,6 +4659,58 @@
       </w:pPr>
       <w:r>
         <w:t>Resolution, connection establishment and application exchange form a dependency chain.</w:t>
+      </w:r>
+    </w:p>
+    <w:p>
+      <w:pPr>
+        <w:jc w:val="center"/>
+      </w:pPr>
+      <w:r>
+        <w:drawing>
+          <wp:inline xmlns:a="http://schemas.openxmlformats.org/drawingml/2006/main" xmlns:pic="http://schemas.openxmlformats.org/drawingml/2006/picture">
+            <wp:extent cx="5760720" cy="3578386"/>
+            <wp:docPr id="16" name="Picture 16"/>
+            <wp:cNvGraphicFramePr>
+              <a:graphicFrameLocks noChangeAspect="1"/>
+            </wp:cNvGraphicFramePr>
+            <a:graphic>
+              <a:graphicData uri="http://schemas.openxmlformats.org/drawingml/2006/picture">
+                <pic:pic>
+                  <pic:nvPicPr>
+                    <pic:cNvPr id="0" name="ref-022.png"/>
+                    <pic:cNvPicPr/>
+                  </pic:nvPicPr>
+                  <pic:blipFill>
+                    <a:blip r:embed="rId24"/>
+                    <a:stretch>
+                      <a:fillRect/>
+                    </a:stretch>
+                  </pic:blipFill>
+                  <pic:spPr>
+                    <a:xfrm>
+                      <a:off x="0" y="0"/>
+                      <a:ext cx="5760720" cy="3578386"/>
+                    </a:xfrm>
+                    <a:prstGeom prst="rect"/>
+                  </pic:spPr>
+                </pic:pic>
+              </a:graphicData>
+            </a:graphic>
+          </wp:inline>
+        </w:drawing>
+      </w:r>
+    </w:p>
+    <w:p>
+      <w:pPr>
+        <w:jc w:val="center"/>
+      </w:pPr>
+      <w:r>
+        <w:rPr>
+          <w:i/>
+          <w:color w:val="555B66"/>
+          <w:sz w:val="18"/>
+        </w:rPr>
+        <w:t>The TCP/IP Protocol Suite — Where common protocols sit</w:t>
       </w:r>
     </w:p>
     <w:p>
@@ -4093,6 +4931,58 @@
       </w:r>
     </w:p>
     <w:p>
+      <w:pPr>
+        <w:jc w:val="center"/>
+      </w:pPr>
+      <w:r>
+        <w:drawing>
+          <wp:inline xmlns:a="http://schemas.openxmlformats.org/drawingml/2006/main" xmlns:pic="http://schemas.openxmlformats.org/drawingml/2006/picture">
+            <wp:extent cx="5760720" cy="779392"/>
+            <wp:docPr id="17" name="Picture 17"/>
+            <wp:cNvGraphicFramePr>
+              <a:graphicFrameLocks noChangeAspect="1"/>
+            </wp:cNvGraphicFramePr>
+            <a:graphic>
+              <a:graphicData uri="http://schemas.openxmlformats.org/drawingml/2006/picture">
+                <pic:pic>
+                  <pic:nvPicPr>
+                    <pic:cNvPr id="0" name="lab-08-evidence.png"/>
+                    <pic:cNvPicPr/>
+                  </pic:nvPicPr>
+                  <pic:blipFill>
+                    <a:blip r:embed="rId25"/>
+                    <a:stretch>
+                      <a:fillRect/>
+                    </a:stretch>
+                  </pic:blipFill>
+                  <pic:spPr>
+                    <a:xfrm>
+                      <a:off x="0" y="0"/>
+                      <a:ext cx="5760720" cy="779392"/>
+                    </a:xfrm>
+                    <a:prstGeom prst="rect"/>
+                  </pic:spPr>
+                </pic:pic>
+              </a:graphicData>
+            </a:graphic>
+          </wp:inline>
+        </w:drawing>
+      </w:r>
+    </w:p>
+    <w:p>
+      <w:pPr>
+        <w:jc w:val="center"/>
+      </w:pPr>
+      <w:r>
+        <w:rPr>
+          <w:i/>
+          <w:color w:val="555B66"/>
+          <w:sz w:val="18"/>
+        </w:rPr>
+        <w:t>Lab 8 expected evidence — the packet list your filter should produce</w:t>
+      </w:r>
+    </w:p>
+    <w:p>
       <w:r>
         <w:rPr>
           <w:b/>
@@ -4224,6 +5114,58 @@
       </w:pPr>
       <w:r>
         <w:t>DNS response time is a measured exchange, influenced by resolver and path behaviour.</w:t>
+      </w:r>
+    </w:p>
+    <w:p>
+      <w:pPr>
+        <w:jc w:val="center"/>
+      </w:pPr>
+      <w:r>
+        <w:drawing>
+          <wp:inline xmlns:a="http://schemas.openxmlformats.org/drawingml/2006/main" xmlns:pic="http://schemas.openxmlformats.org/drawingml/2006/picture">
+            <wp:extent cx="5760720" cy="2580705"/>
+            <wp:docPr id="18" name="Picture 18"/>
+            <wp:cNvGraphicFramePr>
+              <a:graphicFrameLocks noChangeAspect="1"/>
+            </wp:cNvGraphicFramePr>
+            <a:graphic>
+              <a:graphicData uri="http://schemas.openxmlformats.org/drawingml/2006/picture">
+                <pic:pic>
+                  <pic:nvPicPr>
+                    <pic:cNvPr id="0" name="ref-028.png"/>
+                    <pic:cNvPicPr/>
+                  </pic:nvPicPr>
+                  <pic:blipFill>
+                    <a:blip r:embed="rId26"/>
+                    <a:stretch>
+                      <a:fillRect/>
+                    </a:stretch>
+                  </pic:blipFill>
+                  <pic:spPr>
+                    <a:xfrm>
+                      <a:off x="0" y="0"/>
+                      <a:ext cx="5760720" cy="2580705"/>
+                    </a:xfrm>
+                    <a:prstGeom prst="rect"/>
+                  </pic:spPr>
+                </pic:pic>
+              </a:graphicData>
+            </a:graphic>
+          </wp:inline>
+        </w:drawing>
+      </w:r>
+    </w:p>
+    <w:p>
+      <w:pPr>
+        <w:jc w:val="center"/>
+      </w:pPr>
+      <w:r>
+        <w:rPr>
+          <w:i/>
+          <w:color w:val="555B66"/>
+          <w:sz w:val="18"/>
+        </w:rPr>
+        <w:t>How DNS Works — Name resolution through a local resolver</w:t>
       </w:r>
     </w:p>
     <w:p>
@@ -4444,6 +5386,58 @@
       </w:r>
     </w:p>
     <w:p>
+      <w:pPr>
+        <w:jc w:val="center"/>
+      </w:pPr>
+      <w:r>
+        <w:drawing>
+          <wp:inline xmlns:a="http://schemas.openxmlformats.org/drawingml/2006/main" xmlns:pic="http://schemas.openxmlformats.org/drawingml/2006/picture">
+            <wp:extent cx="5760720" cy="643845"/>
+            <wp:docPr id="19" name="Picture 19"/>
+            <wp:cNvGraphicFramePr>
+              <a:graphicFrameLocks noChangeAspect="1"/>
+            </wp:cNvGraphicFramePr>
+            <a:graphic>
+              <a:graphicData uri="http://schemas.openxmlformats.org/drawingml/2006/picture">
+                <pic:pic>
+                  <pic:nvPicPr>
+                    <pic:cNvPr id="0" name="lab-07-evidence.png"/>
+                    <pic:cNvPicPr/>
+                  </pic:nvPicPr>
+                  <pic:blipFill>
+                    <a:blip r:embed="rId23"/>
+                    <a:stretch>
+                      <a:fillRect/>
+                    </a:stretch>
+                  </pic:blipFill>
+                  <pic:spPr>
+                    <a:xfrm>
+                      <a:off x="0" y="0"/>
+                      <a:ext cx="5760720" cy="643845"/>
+                    </a:xfrm>
+                    <a:prstGeom prst="rect"/>
+                  </pic:spPr>
+                </pic:pic>
+              </a:graphicData>
+            </a:graphic>
+          </wp:inline>
+        </w:drawing>
+      </w:r>
+    </w:p>
+    <w:p>
+      <w:pPr>
+        <w:jc w:val="center"/>
+      </w:pPr>
+      <w:r>
+        <w:rPr>
+          <w:i/>
+          <w:color w:val="555B66"/>
+          <w:sz w:val="18"/>
+        </w:rPr>
+        <w:t>Lab 9 expected evidence — the packet list your filter should produce</w:t>
+      </w:r>
+    </w:p>
+    <w:p>
       <w:r>
         <w:rPr>
           <w:b/>
@@ -4795,6 +5789,58 @@
       </w:r>
     </w:p>
     <w:p>
+      <w:pPr>
+        <w:jc w:val="center"/>
+      </w:pPr>
+      <w:r>
+        <w:drawing>
+          <wp:inline xmlns:a="http://schemas.openxmlformats.org/drawingml/2006/main" xmlns:pic="http://schemas.openxmlformats.org/drawingml/2006/picture">
+            <wp:extent cx="5760720" cy="643845"/>
+            <wp:docPr id="20" name="Picture 20"/>
+            <wp:cNvGraphicFramePr>
+              <a:graphicFrameLocks noChangeAspect="1"/>
+            </wp:cNvGraphicFramePr>
+            <a:graphic>
+              <a:graphicData uri="http://schemas.openxmlformats.org/drawingml/2006/picture">
+                <pic:pic>
+                  <pic:nvPicPr>
+                    <pic:cNvPr id="0" name="lab-10-evidence.png"/>
+                    <pic:cNvPicPr/>
+                  </pic:nvPicPr>
+                  <pic:blipFill>
+                    <a:blip r:embed="rId27"/>
+                    <a:stretch>
+                      <a:fillRect/>
+                    </a:stretch>
+                  </pic:blipFill>
+                  <pic:spPr>
+                    <a:xfrm>
+                      <a:off x="0" y="0"/>
+                      <a:ext cx="5760720" cy="643845"/>
+                    </a:xfrm>
+                    <a:prstGeom prst="rect"/>
+                  </pic:spPr>
+                </pic:pic>
+              </a:graphicData>
+            </a:graphic>
+          </wp:inline>
+        </w:drawing>
+      </w:r>
+    </w:p>
+    <w:p>
+      <w:pPr>
+        <w:jc w:val="center"/>
+      </w:pPr>
+      <w:r>
+        <w:rPr>
+          <w:i/>
+          <w:color w:val="555B66"/>
+          <w:sz w:val="18"/>
+        </w:rPr>
+        <w:t>Lab 10 expected evidence — the packet list your filter should produce</w:t>
+      </w:r>
+    </w:p>
+    <w:p>
       <w:r>
         <w:rPr>
           <w:b/>
@@ -4926,6 +5972,58 @@
       </w:pPr>
       <w:r>
         <w:t>Fragmentation fields describe packet handling; missing fragments can reflect capture limitations.</w:t>
+      </w:r>
+    </w:p>
+    <w:p>
+      <w:pPr>
+        <w:jc w:val="center"/>
+      </w:pPr>
+      <w:r>
+        <w:drawing>
+          <wp:inline xmlns:a="http://schemas.openxmlformats.org/drawingml/2006/main" xmlns:pic="http://schemas.openxmlformats.org/drawingml/2006/picture">
+            <wp:extent cx="5760720" cy="2221454"/>
+            <wp:docPr id="21" name="Picture 21"/>
+            <wp:cNvGraphicFramePr>
+              <a:graphicFrameLocks noChangeAspect="1"/>
+            </wp:cNvGraphicFramePr>
+            <a:graphic>
+              <a:graphicData uri="http://schemas.openxmlformats.org/drawingml/2006/picture">
+                <pic:pic>
+                  <pic:nvPicPr>
+                    <pic:cNvPr id="0" name="ref-137.png"/>
+                    <pic:cNvPicPr/>
+                  </pic:nvPicPr>
+                  <pic:blipFill>
+                    <a:blip r:embed="rId28"/>
+                    <a:stretch>
+                      <a:fillRect/>
+                    </a:stretch>
+                  </pic:blipFill>
+                  <pic:spPr>
+                    <a:xfrm>
+                      <a:off x="0" y="0"/>
+                      <a:ext cx="5760720" cy="2221454"/>
+                    </a:xfrm>
+                    <a:prstGeom prst="rect"/>
+                  </pic:spPr>
+                </pic:pic>
+              </a:graphicData>
+            </a:graphic>
+          </wp:inline>
+        </w:drawing>
+      </w:r>
+    </w:p>
+    <w:p>
+      <w:pPr>
+        <w:jc w:val="center"/>
+      </w:pPr>
+      <w:r>
+        <w:rPr>
+          <w:i/>
+          <w:color w:val="555B66"/>
+          <w:sz w:val="18"/>
+        </w:rPr>
+        <w:t>IPv4 Header Essentials — Header layout (TCP header shown; IPv4 uses the same 32-bit rows)</w:t>
       </w:r>
     </w:p>
     <w:p>
@@ -5146,6 +6244,58 @@
       </w:r>
     </w:p>
     <w:p>
+      <w:pPr>
+        <w:jc w:val="center"/>
+      </w:pPr>
+      <w:r>
+        <w:drawing>
+          <wp:inline xmlns:a="http://schemas.openxmlformats.org/drawingml/2006/main" xmlns:pic="http://schemas.openxmlformats.org/drawingml/2006/picture">
+            <wp:extent cx="5760720" cy="643845"/>
+            <wp:docPr id="22" name="Picture 22"/>
+            <wp:cNvGraphicFramePr>
+              <a:graphicFrameLocks noChangeAspect="1"/>
+            </wp:cNvGraphicFramePr>
+            <a:graphic>
+              <a:graphicData uri="http://schemas.openxmlformats.org/drawingml/2006/picture">
+                <pic:pic>
+                  <pic:nvPicPr>
+                    <pic:cNvPr id="0" name="lab-11-evidence.png"/>
+                    <pic:cNvPicPr/>
+                  </pic:nvPicPr>
+                  <pic:blipFill>
+                    <a:blip r:embed="rId29"/>
+                    <a:stretch>
+                      <a:fillRect/>
+                    </a:stretch>
+                  </pic:blipFill>
+                  <pic:spPr>
+                    <a:xfrm>
+                      <a:off x="0" y="0"/>
+                      <a:ext cx="5760720" cy="643845"/>
+                    </a:xfrm>
+                    <a:prstGeom prst="rect"/>
+                  </pic:spPr>
+                </pic:pic>
+              </a:graphicData>
+            </a:graphic>
+          </wp:inline>
+        </w:drawing>
+      </w:r>
+    </w:p>
+    <w:p>
+      <w:pPr>
+        <w:jc w:val="center"/>
+      </w:pPr>
+      <w:r>
+        <w:rPr>
+          <w:i/>
+          <w:color w:val="555B66"/>
+          <w:sz w:val="18"/>
+        </w:rPr>
+        <w:t>Lab 11 expected evidence — the packet list your filter should produce</w:t>
+      </w:r>
+    </w:p>
+    <w:p>
       <w:r>
         <w:rPr>
           <w:b/>
@@ -5497,6 +6647,58 @@
       </w:r>
     </w:p>
     <w:p>
+      <w:pPr>
+        <w:jc w:val="center"/>
+      </w:pPr>
+      <w:r>
+        <w:drawing>
+          <wp:inline xmlns:a="http://schemas.openxmlformats.org/drawingml/2006/main" xmlns:pic="http://schemas.openxmlformats.org/drawingml/2006/picture">
+            <wp:extent cx="5760720" cy="643845"/>
+            <wp:docPr id="23" name="Picture 23"/>
+            <wp:cNvGraphicFramePr>
+              <a:graphicFrameLocks noChangeAspect="1"/>
+            </wp:cNvGraphicFramePr>
+            <a:graphic>
+              <a:graphicData uri="http://schemas.openxmlformats.org/drawingml/2006/picture">
+                <pic:pic>
+                  <pic:nvPicPr>
+                    <pic:cNvPr id="0" name="lab-12-evidence.png"/>
+                    <pic:cNvPicPr/>
+                  </pic:nvPicPr>
+                  <pic:blipFill>
+                    <a:blip r:embed="rId30"/>
+                    <a:stretch>
+                      <a:fillRect/>
+                    </a:stretch>
+                  </pic:blipFill>
+                  <pic:spPr>
+                    <a:xfrm>
+                      <a:off x="0" y="0"/>
+                      <a:ext cx="5760720" cy="643845"/>
+                    </a:xfrm>
+                    <a:prstGeom prst="rect"/>
+                  </pic:spPr>
+                </pic:pic>
+              </a:graphicData>
+            </a:graphic>
+          </wp:inline>
+        </w:drawing>
+      </w:r>
+    </w:p>
+    <w:p>
+      <w:pPr>
+        <w:jc w:val="center"/>
+      </w:pPr>
+      <w:r>
+        <w:rPr>
+          <w:i/>
+          <w:color w:val="555B66"/>
+          <w:sz w:val="18"/>
+        </w:rPr>
+        <w:t>Lab 12 expected evidence — the packet list your filter should produce</w:t>
+      </w:r>
+    </w:p>
+    <w:p>
       <w:r>
         <w:rPr>
           <w:b/>
@@ -5628,6 +6830,58 @@
       </w:pPr>
       <w:r>
         <w:t>Following a UDP stream collects datagrams and does not invent missing data.</w:t>
+      </w:r>
+    </w:p>
+    <w:p>
+      <w:pPr>
+        <w:jc w:val="center"/>
+      </w:pPr>
+      <w:r>
+        <w:drawing>
+          <wp:inline xmlns:a="http://schemas.openxmlformats.org/drawingml/2006/main" xmlns:pic="http://schemas.openxmlformats.org/drawingml/2006/picture">
+            <wp:extent cx="5760720" cy="2044126"/>
+            <wp:docPr id="24" name="Picture 24"/>
+            <wp:cNvGraphicFramePr>
+              <a:graphicFrameLocks noChangeAspect="1"/>
+            </wp:cNvGraphicFramePr>
+            <a:graphic>
+              <a:graphicData uri="http://schemas.openxmlformats.org/drawingml/2006/picture">
+                <pic:pic>
+                  <pic:nvPicPr>
+                    <pic:cNvPr id="0" name="ref-141.png"/>
+                    <pic:cNvPicPr/>
+                  </pic:nvPicPr>
+                  <pic:blipFill>
+                    <a:blip r:embed="rId31"/>
+                    <a:stretch>
+                      <a:fillRect/>
+                    </a:stretch>
+                  </pic:blipFill>
+                  <pic:spPr>
+                    <a:xfrm>
+                      <a:off x="0" y="0"/>
+                      <a:ext cx="5760720" cy="2044126"/>
+                    </a:xfrm>
+                    <a:prstGeom prst="rect"/>
+                  </pic:spPr>
+                </pic:pic>
+              </a:graphicData>
+            </a:graphic>
+          </wp:inline>
+        </w:drawing>
+      </w:r>
+    </w:p>
+    <w:p>
+      <w:pPr>
+        <w:jc w:val="center"/>
+      </w:pPr>
+      <w:r>
+        <w:rPr>
+          <w:i/>
+          <w:color w:val="555B66"/>
+          <w:sz w:val="18"/>
+        </w:rPr>
+        <w:t>TCP vs UDP — Header and feature comparison</w:t>
       </w:r>
     </w:p>
     <w:p>
@@ -5848,6 +7102,58 @@
       </w:r>
     </w:p>
     <w:p>
+      <w:pPr>
+        <w:jc w:val="center"/>
+      </w:pPr>
+      <w:r>
+        <w:drawing>
+          <wp:inline xmlns:a="http://schemas.openxmlformats.org/drawingml/2006/main" xmlns:pic="http://schemas.openxmlformats.org/drawingml/2006/picture">
+            <wp:extent cx="5760720" cy="779392"/>
+            <wp:docPr id="25" name="Picture 25"/>
+            <wp:cNvGraphicFramePr>
+              <a:graphicFrameLocks noChangeAspect="1"/>
+            </wp:cNvGraphicFramePr>
+            <a:graphic>
+              <a:graphicData uri="http://schemas.openxmlformats.org/drawingml/2006/picture">
+                <pic:pic>
+                  <pic:nvPicPr>
+                    <pic:cNvPr id="0" name="lab-13-evidence.png"/>
+                    <pic:cNvPicPr/>
+                  </pic:nvPicPr>
+                  <pic:blipFill>
+                    <a:blip r:embed="rId32"/>
+                    <a:stretch>
+                      <a:fillRect/>
+                    </a:stretch>
+                  </pic:blipFill>
+                  <pic:spPr>
+                    <a:xfrm>
+                      <a:off x="0" y="0"/>
+                      <a:ext cx="5760720" cy="779392"/>
+                    </a:xfrm>
+                    <a:prstGeom prst="rect"/>
+                  </pic:spPr>
+                </pic:pic>
+              </a:graphicData>
+            </a:graphic>
+          </wp:inline>
+        </w:drawing>
+      </w:r>
+    </w:p>
+    <w:p>
+      <w:pPr>
+        <w:jc w:val="center"/>
+      </w:pPr>
+      <w:r>
+        <w:rPr>
+          <w:i/>
+          <w:color w:val="555B66"/>
+          <w:sz w:val="18"/>
+        </w:rPr>
+        <w:t>Lab 13 expected evidence — the packet list your filter should produce</w:t>
+      </w:r>
+    </w:p>
+    <w:p>
       <w:r>
         <w:rPr>
           <w:b/>
@@ -5979,6 +7285,58 @@
       </w:pPr>
       <w:r>
         <w:t>Zero window indicates receive-side flow control; it is distinct from network congestion.</w:t>
+      </w:r>
+    </w:p>
+    <w:p>
+      <w:pPr>
+        <w:jc w:val="center"/>
+      </w:pPr>
+      <w:r>
+        <w:drawing>
+          <wp:inline xmlns:a="http://schemas.openxmlformats.org/drawingml/2006/main" xmlns:pic="http://schemas.openxmlformats.org/drawingml/2006/picture">
+            <wp:extent cx="5760720" cy="2715139"/>
+            <wp:docPr id="26" name="Picture 26"/>
+            <wp:cNvGraphicFramePr>
+              <a:graphicFrameLocks noChangeAspect="1"/>
+            </wp:cNvGraphicFramePr>
+            <a:graphic>
+              <a:graphicData uri="http://schemas.openxmlformats.org/drawingml/2006/picture">
+                <pic:pic>
+                  <pic:nvPicPr>
+                    <pic:cNvPr id="0" name="ref-138.png"/>
+                    <pic:cNvPicPr/>
+                  </pic:nvPicPr>
+                  <pic:blipFill>
+                    <a:blip r:embed="rId33"/>
+                    <a:stretch>
+                      <a:fillRect/>
+                    </a:stretch>
+                  </pic:blipFill>
+                  <pic:spPr>
+                    <a:xfrm>
+                      <a:off x="0" y="0"/>
+                      <a:ext cx="5760720" cy="2715139"/>
+                    </a:xfrm>
+                    <a:prstGeom prst="rect"/>
+                  </pic:spPr>
+                </pic:pic>
+              </a:graphicData>
+            </a:graphic>
+          </wp:inline>
+        </w:drawing>
+      </w:r>
+    </w:p>
+    <w:p>
+      <w:pPr>
+        <w:jc w:val="center"/>
+      </w:pPr>
+      <w:r>
+        <w:rPr>
+          <w:i/>
+          <w:color w:val="555B66"/>
+          <w:sz w:val="18"/>
+        </w:rPr>
+        <w:t>The Three-Way Handshake — Connection establishment</w:t>
       </w:r>
     </w:p>
     <w:p>
@@ -6199,6 +7557,58 @@
       </w:r>
     </w:p>
     <w:p>
+      <w:pPr>
+        <w:jc w:val="center"/>
+      </w:pPr>
+      <w:r>
+        <w:drawing>
+          <wp:inline xmlns:a="http://schemas.openxmlformats.org/drawingml/2006/main" xmlns:pic="http://schemas.openxmlformats.org/drawingml/2006/picture">
+            <wp:extent cx="5760720" cy="2033195"/>
+            <wp:docPr id="27" name="Picture 27"/>
+            <wp:cNvGraphicFramePr>
+              <a:graphicFrameLocks noChangeAspect="1"/>
+            </wp:cNvGraphicFramePr>
+            <a:graphic>
+              <a:graphicData uri="http://schemas.openxmlformats.org/drawingml/2006/picture">
+                <pic:pic>
+                  <pic:nvPicPr>
+                    <pic:cNvPr id="0" name="lab-14-evidence.png"/>
+                    <pic:cNvPicPr/>
+                  </pic:nvPicPr>
+                  <pic:blipFill>
+                    <a:blip r:embed="rId34"/>
+                    <a:stretch>
+                      <a:fillRect/>
+                    </a:stretch>
+                  </pic:blipFill>
+                  <pic:spPr>
+                    <a:xfrm>
+                      <a:off x="0" y="0"/>
+                      <a:ext cx="5760720" cy="2033195"/>
+                    </a:xfrm>
+                    <a:prstGeom prst="rect"/>
+                  </pic:spPr>
+                </pic:pic>
+              </a:graphicData>
+            </a:graphic>
+          </wp:inline>
+        </w:drawing>
+      </w:r>
+    </w:p>
+    <w:p>
+      <w:pPr>
+        <w:jc w:val="center"/>
+      </w:pPr>
+      <w:r>
+        <w:rPr>
+          <w:i/>
+          <w:color w:val="555B66"/>
+          <w:sz w:val="18"/>
+        </w:rPr>
+        <w:t>Lab 14 expected evidence — the packet list your filter should produce</w:t>
+      </w:r>
+    </w:p>
+    <w:p>
       <w:r>
         <w:rPr>
           <w:b/>
@@ -6330,6 +7740,58 @@
       </w:pPr>
       <w:r>
         <w:t>RTT samples, application response time and throughput answer different questions.</w:t>
+      </w:r>
+    </w:p>
+    <w:p>
+      <w:pPr>
+        <w:jc w:val="center"/>
+      </w:pPr>
+      <w:r>
+        <w:drawing>
+          <wp:inline xmlns:a="http://schemas.openxmlformats.org/drawingml/2006/main" xmlns:pic="http://schemas.openxmlformats.org/drawingml/2006/picture">
+            <wp:extent cx="5760720" cy="2300765"/>
+            <wp:docPr id="28" name="Picture 28"/>
+            <wp:cNvGraphicFramePr>
+              <a:graphicFrameLocks noChangeAspect="1"/>
+            </wp:cNvGraphicFramePr>
+            <a:graphic>
+              <a:graphicData uri="http://schemas.openxmlformats.org/drawingml/2006/picture">
+                <pic:pic>
+                  <pic:nvPicPr>
+                    <pic:cNvPr id="0" name="ref-251.png"/>
+                    <pic:cNvPicPr/>
+                  </pic:nvPicPr>
+                  <pic:blipFill>
+                    <a:blip r:embed="rId35"/>
+                    <a:stretch>
+                      <a:fillRect/>
+                    </a:stretch>
+                  </pic:blipFill>
+                  <pic:spPr>
+                    <a:xfrm>
+                      <a:off x="0" y="0"/>
+                      <a:ext cx="5760720" cy="2300765"/>
+                    </a:xfrm>
+                    <a:prstGeom prst="rect"/>
+                  </pic:spPr>
+                </pic:pic>
+              </a:graphicData>
+            </a:graphic>
+          </wp:inline>
+        </w:drawing>
+      </w:r>
+    </w:p>
+    <w:p>
+      <w:pPr>
+        <w:jc w:val="center"/>
+      </w:pPr>
+      <w:r>
+        <w:rPr>
+          <w:i/>
+          <w:color w:val="555B66"/>
+          <w:sz w:val="18"/>
+        </w:rPr>
+        <w:t>I/O Graphs — Multiple graphs with different filters on one chart</w:t>
       </w:r>
     </w:p>
     <w:p>
@@ -6550,6 +8012,58 @@
       </w:r>
     </w:p>
     <w:p>
+      <w:pPr>
+        <w:jc w:val="center"/>
+      </w:pPr>
+      <w:r>
+        <w:drawing>
+          <wp:inline xmlns:a="http://schemas.openxmlformats.org/drawingml/2006/main" xmlns:pic="http://schemas.openxmlformats.org/drawingml/2006/picture">
+            <wp:extent cx="5760720" cy="779392"/>
+            <wp:docPr id="29" name="Picture 29"/>
+            <wp:cNvGraphicFramePr>
+              <a:graphicFrameLocks noChangeAspect="1"/>
+            </wp:cNvGraphicFramePr>
+            <a:graphic>
+              <a:graphicData uri="http://schemas.openxmlformats.org/drawingml/2006/picture">
+                <pic:pic>
+                  <pic:nvPicPr>
+                    <pic:cNvPr id="0" name="lab-15-evidence.png"/>
+                    <pic:cNvPicPr/>
+                  </pic:nvPicPr>
+                  <pic:blipFill>
+                    <a:blip r:embed="rId36"/>
+                    <a:stretch>
+                      <a:fillRect/>
+                    </a:stretch>
+                  </pic:blipFill>
+                  <pic:spPr>
+                    <a:xfrm>
+                      <a:off x="0" y="0"/>
+                      <a:ext cx="5760720" cy="779392"/>
+                    </a:xfrm>
+                    <a:prstGeom prst="rect"/>
+                  </pic:spPr>
+                </pic:pic>
+              </a:graphicData>
+            </a:graphic>
+          </wp:inline>
+        </w:drawing>
+      </w:r>
+    </w:p>
+    <w:p>
+      <w:pPr>
+        <w:jc w:val="center"/>
+      </w:pPr>
+      <w:r>
+        <w:rPr>
+          <w:i/>
+          <w:color w:val="555B66"/>
+          <w:sz w:val="18"/>
+        </w:rPr>
+        <w:t>Lab 15 expected evidence — the packet list your filter should produce</w:t>
+      </w:r>
+    </w:p>
+    <w:p>
       <w:r>
         <w:rPr>
           <w:b/>
@@ -6681,6 +8195,58 @@
       </w:pPr>
       <w:r>
         <w:t>HTTP/2 multiplexes frames; encrypted HTTP/2 needs authorised TLS secrets to inspect payload.</w:t>
+      </w:r>
+    </w:p>
+    <w:p>
+      <w:pPr>
+        <w:jc w:val="center"/>
+      </w:pPr>
+      <w:r>
+        <w:drawing>
+          <wp:inline xmlns:a="http://schemas.openxmlformats.org/drawingml/2006/main" xmlns:pic="http://schemas.openxmlformats.org/drawingml/2006/picture">
+            <wp:extent cx="5731011" cy="3840480"/>
+            <wp:docPr id="30" name="Picture 30"/>
+            <wp:cNvGraphicFramePr>
+              <a:graphicFrameLocks noChangeAspect="1"/>
+            </wp:cNvGraphicFramePr>
+            <a:graphic>
+              <a:graphicData uri="http://schemas.openxmlformats.org/drawingml/2006/picture">
+                <pic:pic>
+                  <pic:nvPicPr>
+                    <pic:cNvPr id="0" name="ref-240.png"/>
+                    <pic:cNvPicPr/>
+                  </pic:nvPicPr>
+                  <pic:blipFill>
+                    <a:blip r:embed="rId37"/>
+                    <a:stretch>
+                      <a:fillRect/>
+                    </a:stretch>
+                  </pic:blipFill>
+                  <pic:spPr>
+                    <a:xfrm>
+                      <a:off x="0" y="0"/>
+                      <a:ext cx="5731011" cy="3840480"/>
+                    </a:xfrm>
+                    <a:prstGeom prst="rect"/>
+                  </pic:spPr>
+                </pic:pic>
+              </a:graphicData>
+            </a:graphic>
+          </wp:inline>
+        </w:drawing>
+      </w:r>
+    </w:p>
+    <w:p>
+      <w:pPr>
+        <w:jc w:val="center"/>
+      </w:pPr>
+      <w:r>
+        <w:rPr>
+          <w:i/>
+          <w:color w:val="555B66"/>
+          <w:sz w:val="18"/>
+        </w:rPr>
+        <w:t>Follow the Stream — Follow Stream reassembles the transferred data</w:t>
       </w:r>
     </w:p>
     <w:p>
@@ -6901,6 +8467,58 @@
       </w:r>
     </w:p>
     <w:p>
+      <w:pPr>
+        <w:jc w:val="center"/>
+      </w:pPr>
+      <w:r>
+        <w:drawing>
+          <wp:inline xmlns:a="http://schemas.openxmlformats.org/drawingml/2006/main" xmlns:pic="http://schemas.openxmlformats.org/drawingml/2006/picture">
+            <wp:extent cx="5760720" cy="1474067"/>
+            <wp:docPr id="31" name="Picture 31"/>
+            <wp:cNvGraphicFramePr>
+              <a:graphicFrameLocks noChangeAspect="1"/>
+            </wp:cNvGraphicFramePr>
+            <a:graphic>
+              <a:graphicData uri="http://schemas.openxmlformats.org/drawingml/2006/picture">
+                <pic:pic>
+                  <pic:nvPicPr>
+                    <pic:cNvPr id="0" name="lab-16-evidence.png"/>
+                    <pic:cNvPicPr/>
+                  </pic:nvPicPr>
+                  <pic:blipFill>
+                    <a:blip r:embed="rId38"/>
+                    <a:stretch>
+                      <a:fillRect/>
+                    </a:stretch>
+                  </pic:blipFill>
+                  <pic:spPr>
+                    <a:xfrm>
+                      <a:off x="0" y="0"/>
+                      <a:ext cx="5760720" cy="1474067"/>
+                    </a:xfrm>
+                    <a:prstGeom prst="rect"/>
+                  </pic:spPr>
+                </pic:pic>
+              </a:graphicData>
+            </a:graphic>
+          </wp:inline>
+        </w:drawing>
+      </w:r>
+    </w:p>
+    <w:p>
+      <w:pPr>
+        <w:jc w:val="center"/>
+      </w:pPr>
+      <w:r>
+        <w:rPr>
+          <w:i/>
+          <w:color w:val="555B66"/>
+          <w:sz w:val="18"/>
+        </w:rPr>
+        <w:t>Lab 16 expected evidence — the packet list your filter should produce</w:t>
+      </w:r>
+    </w:p>
+    <w:p>
       <w:r>
         <w:rPr>
           <w:b/>
@@ -7252,6 +8870,58 @@
       </w:r>
     </w:p>
     <w:p>
+      <w:pPr>
+        <w:jc w:val="center"/>
+      </w:pPr>
+      <w:r>
+        <w:drawing>
+          <wp:inline xmlns:a="http://schemas.openxmlformats.org/drawingml/2006/main" xmlns:pic="http://schemas.openxmlformats.org/drawingml/2006/picture">
+            <wp:extent cx="5760720" cy="2727870"/>
+            <wp:docPr id="32" name="Picture 32"/>
+            <wp:cNvGraphicFramePr>
+              <a:graphicFrameLocks noChangeAspect="1"/>
+            </wp:cNvGraphicFramePr>
+            <a:graphic>
+              <a:graphicData uri="http://schemas.openxmlformats.org/drawingml/2006/picture">
+                <pic:pic>
+                  <pic:nvPicPr>
+                    <pic:cNvPr id="0" name="lab-17-evidence.png"/>
+                    <pic:cNvPicPr/>
+                  </pic:nvPicPr>
+                  <pic:blipFill>
+                    <a:blip r:embed="rId39"/>
+                    <a:stretch>
+                      <a:fillRect/>
+                    </a:stretch>
+                  </pic:blipFill>
+                  <pic:spPr>
+                    <a:xfrm>
+                      <a:off x="0" y="0"/>
+                      <a:ext cx="5760720" cy="2727870"/>
+                    </a:xfrm>
+                    <a:prstGeom prst="rect"/>
+                  </pic:spPr>
+                </pic:pic>
+              </a:graphicData>
+            </a:graphic>
+          </wp:inline>
+        </w:drawing>
+      </w:r>
+    </w:p>
+    <w:p>
+      <w:pPr>
+        <w:jc w:val="center"/>
+      </w:pPr>
+      <w:r>
+        <w:rPr>
+          <w:i/>
+          <w:color w:val="555B66"/>
+          <w:sz w:val="18"/>
+        </w:rPr>
+        <w:t>Lab 17 expected evidence — the packet list your filter should produce</w:t>
+      </w:r>
+    </w:p>
+    <w:p>
       <w:r>
         <w:rPr>
           <w:b/>
@@ -7383,6 +9053,58 @@
       </w:pPr>
       <w:r>
         <w:t>A useful report states affected flow, measurement, impact, recommended action and uncertainty.</w:t>
+      </w:r>
+    </w:p>
+    <w:p>
+      <w:pPr>
+        <w:jc w:val="center"/>
+      </w:pPr>
+      <w:r>
+        <w:drawing>
+          <wp:inline xmlns:a="http://schemas.openxmlformats.org/drawingml/2006/main" xmlns:pic="http://schemas.openxmlformats.org/drawingml/2006/picture">
+            <wp:extent cx="5751260" cy="3840480"/>
+            <wp:docPr id="33" name="Picture 33"/>
+            <wp:cNvGraphicFramePr>
+              <a:graphicFrameLocks noChangeAspect="1"/>
+            </wp:cNvGraphicFramePr>
+            <a:graphic>
+              <a:graphicData uri="http://schemas.openxmlformats.org/drawingml/2006/picture">
+                <pic:pic>
+                  <pic:nvPicPr>
+                    <pic:cNvPr id="0" name="ref-248.png"/>
+                    <pic:cNvPicPr/>
+                  </pic:nvPicPr>
+                  <pic:blipFill>
+                    <a:blip r:embed="rId40"/>
+                    <a:stretch>
+                      <a:fillRect/>
+                    </a:stretch>
+                  </pic:blipFill>
+                  <pic:spPr>
+                    <a:xfrm>
+                      <a:off x="0" y="0"/>
+                      <a:ext cx="5751260" cy="3840480"/>
+                    </a:xfrm>
+                    <a:prstGeom prst="rect"/>
+                  </pic:spPr>
+                </pic:pic>
+              </a:graphicData>
+            </a:graphic>
+          </wp:inline>
+        </w:drawing>
+      </w:r>
+    </w:p>
+    <w:p>
+      <w:pPr>
+        <w:jc w:val="center"/>
+      </w:pPr>
+      <w:r>
+        <w:rPr>
+          <w:i/>
+          <w:color w:val="555B66"/>
+          <w:sz w:val="18"/>
+        </w:rPr>
+        <w:t>Export and Preserve Evidence — File | Export Packet Dissections</w:t>
       </w:r>
     </w:p>
     <w:p>
@@ -7603,6 +9325,58 @@
       </w:r>
     </w:p>
     <w:p>
+      <w:pPr>
+        <w:jc w:val="center"/>
+      </w:pPr>
+      <w:r>
+        <w:drawing>
+          <wp:inline xmlns:a="http://schemas.openxmlformats.org/drawingml/2006/main" xmlns:pic="http://schemas.openxmlformats.org/drawingml/2006/picture">
+            <wp:extent cx="5760720" cy="643845"/>
+            <wp:docPr id="34" name="Picture 34"/>
+            <wp:cNvGraphicFramePr>
+              <a:graphicFrameLocks noChangeAspect="1"/>
+            </wp:cNvGraphicFramePr>
+            <a:graphic>
+              <a:graphicData uri="http://schemas.openxmlformats.org/drawingml/2006/picture">
+                <pic:pic>
+                  <pic:nvPicPr>
+                    <pic:cNvPr id="0" name="lab-18-evidence.png"/>
+                    <pic:cNvPicPr/>
+                  </pic:nvPicPr>
+                  <pic:blipFill>
+                    <a:blip r:embed="rId41"/>
+                    <a:stretch>
+                      <a:fillRect/>
+                    </a:stretch>
+                  </pic:blipFill>
+                  <pic:spPr>
+                    <a:xfrm>
+                      <a:off x="0" y="0"/>
+                      <a:ext cx="5760720" cy="643845"/>
+                    </a:xfrm>
+                    <a:prstGeom prst="rect"/>
+                  </pic:spPr>
+                </pic:pic>
+              </a:graphicData>
+            </a:graphic>
+          </wp:inline>
+        </w:drawing>
+      </w:r>
+    </w:p>
+    <w:p>
+      <w:pPr>
+        <w:jc w:val="center"/>
+      </w:pPr>
+      <w:r>
+        <w:rPr>
+          <w:i/>
+          <w:color w:val="555B66"/>
+          <w:sz w:val="18"/>
+        </w:rPr>
+        <w:t>Lab 18 expected evidence — the packet list your filter should produce</w:t>
+      </w:r>
+    </w:p>
+    <w:p>
       <w:r>
         <w:rPr>
           <w:b/>
@@ -7836,7 +9610,7 @@
       </w:r>
     </w:p>
     <w:sectPr>
-      <w:footerReference w:type="default" r:id="rId10"/>
+      <w:footerReference w:type="default" r:id="rId42"/>
       <w:pgSz w:w="12240" w:h="15840"/>
       <w:pgMar w:top="1440" w:right="1800" w:bottom="1440" w:left="1800" w:header="720" w:footer="720" w:gutter="0"/>
       <w:cols w:space="720"/>

</xml_diff>

<commit_message>
feat: C1123 v5.1 — lab scenarios in deck, lab instruction MD/PDF, richer concepts
Replace per-step lab slides with a scenario and four-task summary; full
steps now live in the Learner Guide and in new per-lab
LAB-NN-Instructions.md/.pdf files. Add about 40 concept slides with
visuals drawn from the lab captures (ladder diagrams, DNS/delay charts,
I/O and Stevens graphs) and new content on DHCP, NAT, IPv6, TShark, BPF,
evidence hashing, HTTP/3/QUIC, security patterns and baselining, drawn
from the referenced external sources. Each lab gains a scenario ticket,
findings sheet, lab-specific templates, a TShark equivalent, an optional
attributed extension, and an export script that uses the lab's own
capture.

Co-Authored-By: Claude Opus 5.5 <noreply@anthropic.com>
</commit_message>
<xml_diff>
--- a/courseware/LG-Wireshark Network Analysis Masterclass (C1123).docx
+++ b/courseware/LG-Wireshark Network Analysis Masterclass (C1123).docx
@@ -179,7 +179,7 @@
           <w:color w:val="1F6FEB"/>
           <w:sz w:val="24"/>
         </w:rPr>
-        <w:t>Version 5.0</w:t>
+        <w:t>Version 5.1</w:t>
       </w:r>
     </w:p>
     <w:p>
@@ -399,6 +399,64 @@
           </w:p>
         </w:tc>
       </w:tr>
+      <w:tr>
+        <w:tc>
+          <w:tcPr>
+            <w:tcW w:type="dxa" w:w="2160"/>
+          </w:tcPr>
+          <w:p>
+            <w:r/>
+            <w:r>
+              <w:rPr>
+                <w:sz w:val="19"/>
+              </w:rPr>
+              <w:t>5.1</w:t>
+            </w:r>
+          </w:p>
+        </w:tc>
+        <w:tc>
+          <w:tcPr>
+            <w:tcW w:type="dxa" w:w="2160"/>
+          </w:tcPr>
+          <w:p>
+            <w:r/>
+            <w:r>
+              <w:rPr>
+                <w:sz w:val="19"/>
+              </w:rPr>
+              <w:t>5 October 2026</w:t>
+            </w:r>
+          </w:p>
+        </w:tc>
+        <w:tc>
+          <w:tcPr>
+            <w:tcW w:type="dxa" w:w="2160"/>
+          </w:tcPr>
+          <w:p>
+            <w:r/>
+            <w:r>
+              <w:rPr>
+                <w:sz w:val="19"/>
+              </w:rPr>
+              <w:t>Lab step slides replaced by scenario + summary slides (full steps in the LG and new per-lab instruction MD/PDF). About 40 new concept slides with visuals drawn from the lab captures; DHCP, NAT, IPv6, TShark, security patterns and baselining added from external sources. Per-lab scenario tickets, findings templates, TShark equivalents and optional extensions.</w:t>
+            </w:r>
+          </w:p>
+        </w:tc>
+        <w:tc>
+          <w:tcPr>
+            <w:tcW w:type="dxa" w:w="2160"/>
+          </w:tcPr>
+          <w:p>
+            <w:r/>
+            <w:r>
+              <w:rPr>
+                <w:sz w:val="19"/>
+              </w:rPr>
+              <w:t>Dr. Alfred Ang</w:t>
+            </w:r>
+          </w:p>
+        </w:tc>
+      </w:tr>
     </w:tbl>
     <w:p>
       <w:r>
@@ -550,7 +608,7 @@
         </w:rPr>
         <w:t>Lab 2 — Plan capture placement</w:t>
         <w:tab/>
-        <w:t>8</w:t>
+        <w:t>9</w:t>
       </w:r>
     </w:p>
     <w:p>
@@ -569,7 +627,7 @@
         </w:rPr>
         <w:t>Topic 03 — Global Preferences and Troubleshooting Profiles</w:t>
         <w:tab/>
-        <w:t>10</w:t>
+        <w:t>11</w:t>
       </w:r>
     </w:p>
     <w:p>
@@ -608,7 +666,7 @@
         </w:rPr>
         <w:t>Topic 04 — Navigation and Coloring Techniques</w:t>
         <w:tab/>
-        <w:t>12</w:t>
+        <w:t>13</w:t>
       </w:r>
     </w:p>
     <w:p>
@@ -628,7 +686,7 @@
         </w:rPr>
         <w:t>Lab 4 — Color and annotate evidence</w:t>
         <w:tab/>
-        <w:t>13</w:t>
+        <w:t>14</w:t>
       </w:r>
     </w:p>
     <w:p>
@@ -667,7 +725,7 @@
         </w:rPr>
         <w:t>Lab 5 — Separate path and server delay</w:t>
         <w:tab/>
-        <w:t>15</w:t>
+        <w:t>16</w:t>
       </w:r>
     </w:p>
     <w:p>
@@ -686,7 +744,7 @@
         </w:rPr>
         <w:t>Topic 06 — Trace Statistics and VoIP Overview</w:t>
         <w:tab/>
-        <w:t>17</w:t>
+        <w:t>18</w:t>
       </w:r>
     </w:p>
     <w:p>
@@ -706,7 +764,7 @@
         </w:rPr>
         <w:t>Lab 6 — Summarize traffic and a voice stream</w:t>
         <w:tab/>
-        <w:t>17</w:t>
+        <w:t>18</w:t>
       </w:r>
     </w:p>
     <w:p>
@@ -725,7 +783,7 @@
         </w:rPr>
         <w:t>Topic 07 — Display Filters</w:t>
         <w:tab/>
-        <w:t>19</w:t>
+        <w:t>20</w:t>
       </w:r>
     </w:p>
     <w:p>
@@ -745,7 +803,7 @@
         </w:rPr>
         <w:t>Lab 7 — Build a filter evidence matrix</w:t>
         <w:tab/>
-        <w:t>19</w:t>
+        <w:t>20</w:t>
       </w:r>
     </w:p>
     <w:p>
@@ -764,7 +822,7 @@
         </w:rPr>
         <w:t>Topic 08 — TCP/IP Communications and Resolution</w:t>
         <w:tab/>
-        <w:t>21</w:t>
+        <w:t>22</w:t>
       </w:r>
     </w:p>
     <w:p>
@@ -784,7 +842,7 @@
         </w:rPr>
         <w:t>Lab 8 — Reconstruct an application dependency chain</w:t>
         <w:tab/>
-        <w:t>21</w:t>
+        <w:t>23</w:t>
       </w:r>
     </w:p>
     <w:p>
@@ -803,7 +861,7 @@
         </w:rPr>
         <w:t>Topic 09 — DNS Traffic Analysis</w:t>
         <w:tab/>
-        <w:t>23</w:t>
+        <w:t>25</w:t>
       </w:r>
     </w:p>
     <w:p>
@@ -823,7 +881,7 @@
         </w:rPr>
         <w:t>Lab 9 — Diagnose DNS failure and delay</w:t>
         <w:tab/>
-        <w:t>23</w:t>
+        <w:t>25</w:t>
       </w:r>
     </w:p>
     <w:p>
@@ -842,7 +900,7 @@
         </w:rPr>
         <w:t>Topic 10 — ARP Traffic Analysis</w:t>
         <w:tab/>
-        <w:t>25</w:t>
+        <w:t>27</w:t>
       </w:r>
     </w:p>
     <w:p>
@@ -862,7 +920,7 @@
         </w:rPr>
         <w:t>Lab 10 — Verify link-local resolution</w:t>
         <w:tab/>
-        <w:t>25</w:t>
+        <w:t>27</w:t>
       </w:r>
     </w:p>
     <w:p>
@@ -881,7 +939,7 @@
         </w:rPr>
         <w:t>Topic 11 — IPv4 Traffic Analysis</w:t>
         <w:tab/>
-        <w:t>26</w:t>
+        <w:t>29</w:t>
       </w:r>
     </w:p>
     <w:p>
@@ -901,7 +959,7 @@
         </w:rPr>
         <w:t>Lab 11 — Classify IPv4 scope and headers</w:t>
         <w:tab/>
-        <w:t>27</w:t>
+        <w:t>29</w:t>
       </w:r>
     </w:p>
     <w:p>
@@ -920,7 +978,7 @@
         </w:rPr>
         <w:t>Topic 12 — ICMP Traffic Analysis</w:t>
         <w:tab/>
-        <w:t>28</w:t>
+        <w:t>31</w:t>
       </w:r>
     </w:p>
     <w:p>
@@ -940,7 +998,7 @@
         </w:rPr>
         <w:t>Lab 12 — Interpret echo and unreachable messages</w:t>
         <w:tab/>
-        <w:t>28</w:t>
+        <w:t>31</w:t>
       </w:r>
     </w:p>
     <w:p>
@@ -959,7 +1017,7 @@
         </w:rPr>
         <w:t>Topic 13 — UDP Traffic Analysis</w:t>
         <w:tab/>
-        <w:t>30</w:t>
+        <w:t>33</w:t>
       </w:r>
     </w:p>
     <w:p>
@@ -979,7 +1037,7 @@
         </w:rPr>
         <w:t>Lab 13 — Follow datagrams and service refusal</w:t>
         <w:tab/>
-        <w:t>30</w:t>
+        <w:t>33</w:t>
       </w:r>
     </w:p>
     <w:p>
@@ -998,7 +1056,7 @@
         </w:rPr>
         <w:t>Topic 14 — TCP Protocol Analysis</w:t>
         <w:tab/>
-        <w:t>32</w:t>
+        <w:t>35</w:t>
       </w:r>
     </w:p>
     <w:p>
@@ -1018,7 +1076,7 @@
         </w:rPr>
         <w:t>Lab 14 — Investigate retransmission and zero window</w:t>
         <w:tab/>
-        <w:t>32</w:t>
+        <w:t>36</w:t>
       </w:r>
     </w:p>
     <w:p>
@@ -1037,7 +1095,7 @@
         </w:rPr>
         <w:t>Topic 15 — Traffic Graphs</w:t>
         <w:tab/>
-        <w:t>34</w:t>
+        <w:t>38</w:t>
       </w:r>
     </w:p>
     <w:p>
@@ -1057,7 +1115,7 @@
         </w:rPr>
         <w:t>Lab 15 — Graph bytes, RTT and recovery</w:t>
         <w:tab/>
-        <w:t>34</w:t>
+        <w:t>38</w:t>
       </w:r>
     </w:p>
     <w:p>
@@ -1076,7 +1134,7 @@
         </w:rPr>
         <w:t>Topic 16 — HTTP and HTTP/2 Analysis</w:t>
         <w:tab/>
-        <w:t>36</w:t>
+        <w:t>40</w:t>
       </w:r>
     </w:p>
     <w:p>
@@ -1096,7 +1154,7 @@
         </w:rPr>
         <w:t>Lab 16 — Inspect HTTP outcomes and HTTP/2 frames</w:t>
         <w:tab/>
-        <w:t>37</w:t>
+        <w:t>41</w:t>
       </w:r>
     </w:p>
     <w:p>
@@ -1115,7 +1173,7 @@
         </w:rPr>
         <w:t>Topic 17 — TLS-Encrypted Traffic Analysis</w:t>
         <w:tab/>
-        <w:t>39</w:t>
+        <w:t>42</w:t>
       </w:r>
     </w:p>
     <w:p>
@@ -1135,7 +1193,7 @@
         </w:rPr>
         <w:t>Lab 17 — Compare encrypted and decrypted views</w:t>
         <w:tab/>
-        <w:t>39</w:t>
+        <w:t>43</w:t>
       </w:r>
     </w:p>
     <w:p>
@@ -1154,7 +1212,7 @@
         </w:rPr>
         <w:t>Topic 18 — Ten Troubleshooting Steps and Reporting</w:t>
         <w:tab/>
-        <w:t>41</w:t>
+        <w:t>45</w:t>
       </w:r>
     </w:p>
     <w:p>
@@ -1174,7 +1232,7 @@
         </w:rPr>
         <w:t>Lab 18 — Produce an evidence-led incident report</w:t>
         <w:tab/>
-        <w:t>41</w:t>
+        <w:t>46</w:t>
       </w:r>
     </w:p>
     <w:p>
@@ -1193,7 +1251,7 @@
         </w:rPr>
         <w:t>Next Steps</w:t>
         <w:tab/>
-        <w:t>43</w:t>
+        <w:t>48</w:t>
       </w:r>
     </w:p>
     <w:p>
@@ -1210,9 +1268,28 @@
           <w:color w:val="333333"/>
           <w:sz w:val="22"/>
         </w:rPr>
+        <w:t>Further Learning</w:t>
+        <w:tab/>
+        <w:t>48</w:t>
+      </w:r>
+    </w:p>
+    <w:p>
+      <w:pPr>
+        <w:tabs>
+          <w:tab w:pos="9072" w:val="right" w:leader="dot"/>
+        </w:tabs>
+        <w:spacing w:after="60"/>
+      </w:pPr>
+      <w:r>
+        <w:rPr>
+          <w:rFonts w:ascii="Arial" w:hAnsi="Arial"/>
+          <w:b/>
+          <w:color w:val="333333"/>
+          <w:sz w:val="22"/>
+        </w:rPr>
         <w:t>Glossary</w:t>
         <w:tab/>
-        <w:t>43</w:t>
+        <w:t>48</w:t>
       </w:r>
     </w:p>
     <w:p>
@@ -1825,18 +1902,23 @@
           <w:color w:val="1F6FEB"/>
           <w:sz w:val="22"/>
         </w:rPr>
-        <w:t>Challenge</w:t>
+        <w:t>Try it with TShark</w:t>
       </w:r>
     </w:p>
     <w:p>
       <w:pPr>
         <w:keepLines/>
-      </w:pPr>
-      <w:r>
-        <w:rPr>
-          <w:b w:val="0"/>
-        </w:rPr>
-        <w:t>Develop and explain an alternative filter.</w:t>
+        <w:shd w:fill="EAF2FF"/>
+        <w:spacing w:before="80" w:after="60"/>
+        <w:ind w:left="200" w:right="200"/>
+      </w:pPr>
+      <w:r>
+        <w:rPr>
+          <w:rFonts w:ascii="Consolas" w:hAnsi="Consolas"/>
+          <w:color w:val="0B3060"/>
+          <w:sz w:val="19"/>
+        </w:rPr>
+        <w:t>tshark -n -r data/branch-office.pcap -Y arp</w:t>
       </w:r>
     </w:p>
     <w:p>
@@ -1846,7 +1928,7 @@
           <w:color w:val="1F6FEB"/>
           <w:sz w:val="22"/>
         </w:rPr>
-        <w:t>Reflection</w:t>
+        <w:t>Challenge</w:t>
       </w:r>
     </w:p>
     <w:p>
@@ -1857,7 +1939,7 @@
         <w:rPr>
           <w:b w:val="0"/>
         </w:rPr>
-        <w:t>Which second observation point would strengthen your conclusion?</w:t>
+        <w:t>Develop and explain an alternative filter.</w:t>
       </w:r>
     </w:p>
     <w:p>
@@ -1865,6 +1947,48 @@
         <w:rPr>
           <w:b/>
           <w:color w:val="1F6FEB"/>
+          <w:sz w:val="22"/>
+        </w:rPr>
+        <w:t>Reflection</w:t>
+      </w:r>
+    </w:p>
+    <w:p>
+      <w:pPr>
+        <w:keepLines/>
+      </w:pPr>
+      <w:r>
+        <w:rPr>
+          <w:b w:val="0"/>
+        </w:rPr>
+        <w:t>Which second observation point would strengthen your conclusion?</w:t>
+      </w:r>
+    </w:p>
+    <w:p>
+      <w:r>
+        <w:rPr>
+          <w:b/>
+          <w:color w:val="1F6FEB"/>
+          <w:sz w:val="22"/>
+        </w:rPr>
+        <w:t>Extension (optional)</w:t>
+      </w:r>
+    </w:p>
+    <w:p>
+      <w:pPr>
+        <w:keepLines/>
+      </w:pPr>
+      <w:r>
+        <w:rPr>
+          <w:b w:val="0"/>
+        </w:rPr>
+        <w:t>Getting Started lab — capture your own short baseline on an authorised network and compare its protocol mix with this file. Source: J.F. Kurose and K.W. Ross, Wireshark Labs (gaia.cs.umass.edu/kurose_ross/wireshark.php).</w:t>
+      </w:r>
+    </w:p>
+    <w:p>
+      <w:r>
+        <w:rPr>
+          <w:b/>
+          <w:color w:val="1F6FEB"/>
         </w:rPr>
         <w:t xml:space="preserve">Note: </w:t>
       </w:r>
@@ -1872,7 +1996,7 @@
         <w:rPr>
           <w:sz w:val="20"/>
         </w:rPr>
-        <w:t>Full commands are in labs/lab-01-*/README.md. Use the README in the matching labs/lab-NN-title/ folder. Capture only with permission.</w:t>
+        <w:t>Printable copy: labs/lab-01-establish-a-trace-baseline/LAB-01-Instructions.pdf. Use the README in the matching labs/lab-NN-title/ folder. Capture only with permission.</w:t>
       </w:r>
     </w:p>
     <w:p/>
@@ -2280,18 +2404,23 @@
           <w:color w:val="1F6FEB"/>
           <w:sz w:val="22"/>
         </w:rPr>
-        <w:t>Challenge</w:t>
+        <w:t>Try it with TShark</w:t>
       </w:r>
     </w:p>
     <w:p>
       <w:pPr>
         <w:keepLines/>
-      </w:pPr>
-      <w:r>
-        <w:rPr>
-          <w:b w:val="0"/>
-        </w:rPr>
-        <w:t>Develop and explain an alternative filter.</w:t>
+        <w:shd w:fill="EAF2FF"/>
+        <w:spacing w:before="80" w:after="60"/>
+        <w:ind w:left="200" w:right="200"/>
+      </w:pPr>
+      <w:r>
+        <w:rPr>
+          <w:rFonts w:ascii="Consolas" w:hAnsi="Consolas"/>
+          <w:color w:val="0B3060"/>
+          <w:sz w:val="19"/>
+        </w:rPr>
+        <w:t>tshark -D</w:t>
       </w:r>
     </w:p>
     <w:p>
@@ -2301,7 +2430,7 @@
           <w:color w:val="1F6FEB"/>
           <w:sz w:val="22"/>
         </w:rPr>
-        <w:t>Reflection</w:t>
+        <w:t>Challenge</w:t>
       </w:r>
     </w:p>
     <w:p>
@@ -2312,7 +2441,7 @@
         <w:rPr>
           <w:b w:val="0"/>
         </w:rPr>
-        <w:t>Which second observation point would strengthen your conclusion?</w:t>
+        <w:t>Develop and explain an alternative filter.</w:t>
       </w:r>
     </w:p>
     <w:p>
@@ -2320,6 +2449,48 @@
         <w:rPr>
           <w:b/>
           <w:color w:val="1F6FEB"/>
+          <w:sz w:val="22"/>
+        </w:rPr>
+        <w:t>Reflection</w:t>
+      </w:r>
+    </w:p>
+    <w:p>
+      <w:pPr>
+        <w:keepLines/>
+      </w:pPr>
+      <w:r>
+        <w:rPr>
+          <w:b w:val="0"/>
+        </w:rPr>
+        <w:t>Which second observation point would strengthen your conclusion?</w:t>
+      </w:r>
+    </w:p>
+    <w:p>
+      <w:r>
+        <w:rPr>
+          <w:b/>
+          <w:color w:val="1F6FEB"/>
+          <w:sz w:val="22"/>
+        </w:rPr>
+        <w:t>Extension (optional)</w:t>
+      </w:r>
+    </w:p>
+    <w:p>
+      <w:pPr>
+        <w:keepLines/>
+      </w:pPr>
+      <w:r>
+        <w:rPr>
+          <w:b w:val="0"/>
+        </w:rPr>
+        <w:t>Getting Started lab — list your interfaces and identify which one carries traffic before planning a capture. Source: J.F. Kurose and K.W. Ross, Wireshark Labs (gaia.cs.umass.edu/kurose_ross/wireshark.php).</w:t>
+      </w:r>
+    </w:p>
+    <w:p>
+      <w:r>
+        <w:rPr>
+          <w:b/>
+          <w:color w:val="1F6FEB"/>
         </w:rPr>
         <w:t xml:space="preserve">Note: </w:t>
       </w:r>
@@ -2327,7 +2498,7 @@
         <w:rPr>
           <w:sz w:val="20"/>
         </w:rPr>
-        <w:t>Full commands are in labs/lab-02-*/README.md. Use the README in the matching labs/lab-NN-title/ folder. Capture only with permission.</w:t>
+        <w:t>Printable copy: labs/lab-02-plan-capture-placement/LAB-02-Instructions.pdf. Use the README in the matching labs/lab-NN-title/ folder. Capture only with permission.</w:t>
       </w:r>
     </w:p>
     <w:p/>
@@ -2735,18 +2906,23 @@
           <w:color w:val="1F6FEB"/>
           <w:sz w:val="22"/>
         </w:rPr>
-        <w:t>Challenge</w:t>
+        <w:t>Try it with TShark</w:t>
       </w:r>
     </w:p>
     <w:p>
       <w:pPr>
         <w:keepLines/>
-      </w:pPr>
-      <w:r>
-        <w:rPr>
-          <w:b w:val="0"/>
-        </w:rPr>
-        <w:t>Develop and explain an alternative filter.</w:t>
+        <w:shd w:fill="EAF2FF"/>
+        <w:spacing w:before="80" w:after="60"/>
+        <w:ind w:left="200" w:right="200"/>
+      </w:pPr>
+      <w:r>
+        <w:rPr>
+          <w:rFonts w:ascii="Consolas" w:hAnsi="Consolas"/>
+          <w:color w:val="0B3060"/>
+          <w:sz w:val="19"/>
+        </w:rPr>
+        <w:t>tshark -n -r data/branch-office.pcap -Y dns -T fields -e frame.number -e ip.src -e ip.dst -e dns.qry.name</w:t>
       </w:r>
     </w:p>
     <w:p>
@@ -2756,7 +2932,7 @@
           <w:color w:val="1F6FEB"/>
           <w:sz w:val="22"/>
         </w:rPr>
-        <w:t>Reflection</w:t>
+        <w:t>Challenge</w:t>
       </w:r>
     </w:p>
     <w:p>
@@ -2767,7 +2943,7 @@
         <w:rPr>
           <w:b w:val="0"/>
         </w:rPr>
-        <w:t>Which second observation point would strengthen your conclusion?</w:t>
+        <w:t>Develop and explain an alternative filter.</w:t>
       </w:r>
     </w:p>
     <w:p>
@@ -2775,6 +2951,48 @@
         <w:rPr>
           <w:b/>
           <w:color w:val="1F6FEB"/>
+          <w:sz w:val="22"/>
+        </w:rPr>
+        <w:t>Reflection</w:t>
+      </w:r>
+    </w:p>
+    <w:p>
+      <w:pPr>
+        <w:keepLines/>
+      </w:pPr>
+      <w:r>
+        <w:rPr>
+          <w:b w:val="0"/>
+        </w:rPr>
+        <w:t>Which second observation point would strengthen your conclusion?</w:t>
+      </w:r>
+    </w:p>
+    <w:p>
+      <w:r>
+        <w:rPr>
+          <w:b/>
+          <w:color w:val="1F6FEB"/>
+          <w:sz w:val="22"/>
+        </w:rPr>
+        <w:t>Extension (optional)</w:t>
+      </w:r>
+    </w:p>
+    <w:p>
+      <w:pPr>
+        <w:keepLines/>
+      </w:pPr>
+      <w:r>
+        <w:rPr>
+          <w:b w:val="0"/>
+        </w:rPr>
+        <w:t>Export your C1123-Analyst profile folder and import it on a second machine; confirm the columns appear.</w:t>
+      </w:r>
+    </w:p>
+    <w:p>
+      <w:r>
+        <w:rPr>
+          <w:b/>
+          <w:color w:val="1F6FEB"/>
         </w:rPr>
         <w:t xml:space="preserve">Note: </w:t>
       </w:r>
@@ -2782,7 +3000,7 @@
         <w:rPr>
           <w:sz w:val="20"/>
         </w:rPr>
-        <w:t>Full commands are in labs/lab-03-*/README.md. Use the README in the matching labs/lab-NN-title/ folder. Capture only with permission.</w:t>
+        <w:t>Printable copy: labs/lab-03-create-an-analyst-profile/LAB-03-Instructions.pdf. Use the README in the matching labs/lab-NN-title/ folder. Capture only with permission.</w:t>
       </w:r>
     </w:p>
     <w:p/>
@@ -3190,18 +3408,23 @@
           <w:color w:val="1F6FEB"/>
           <w:sz w:val="22"/>
         </w:rPr>
-        <w:t>Challenge</w:t>
+        <w:t>Try it with TShark</w:t>
       </w:r>
     </w:p>
     <w:p>
       <w:pPr>
         <w:keepLines/>
-      </w:pPr>
-      <w:r>
-        <w:rPr>
-          <w:b w:val="0"/>
-        </w:rPr>
-        <w:t>Develop and explain an alternative filter.</w:t>
+        <w:shd w:fill="EAF2FF"/>
+        <w:spacing w:before="80" w:after="60"/>
+        <w:ind w:left="200" w:right="200"/>
+      </w:pPr>
+      <w:r>
+        <w:rPr>
+          <w:rFonts w:ascii="Consolas" w:hAnsi="Consolas"/>
+          <w:color w:val="0B3060"/>
+          <w:sz w:val="19"/>
+        </w:rPr>
+        <w:t>tshark -n -r data/branch-office.pcap -Y "http.response.code &gt;= 400" -T fields -e frame.number -e http.response.code -e http.request_in -e http.time</w:t>
       </w:r>
     </w:p>
     <w:p>
@@ -3211,7 +3434,7 @@
           <w:color w:val="1F6FEB"/>
           <w:sz w:val="22"/>
         </w:rPr>
-        <w:t>Reflection</w:t>
+        <w:t>Challenge</w:t>
       </w:r>
     </w:p>
     <w:p>
@@ -3222,7 +3445,7 @@
         <w:rPr>
           <w:b w:val="0"/>
         </w:rPr>
-        <w:t>Which second observation point would strengthen your conclusion?</w:t>
+        <w:t>Develop and explain an alternative filter.</w:t>
       </w:r>
     </w:p>
     <w:p>
@@ -3230,6 +3453,48 @@
         <w:rPr>
           <w:b/>
           <w:color w:val="1F6FEB"/>
+          <w:sz w:val="22"/>
+        </w:rPr>
+        <w:t>Reflection</w:t>
+      </w:r>
+    </w:p>
+    <w:p>
+      <w:pPr>
+        <w:keepLines/>
+      </w:pPr>
+      <w:r>
+        <w:rPr>
+          <w:b w:val="0"/>
+        </w:rPr>
+        <w:t>Which second observation point would strengthen your conclusion?</w:t>
+      </w:r>
+    </w:p>
+    <w:p>
+      <w:r>
+        <w:rPr>
+          <w:b/>
+          <w:color w:val="1F6FEB"/>
+          <w:sz w:val="22"/>
+        </w:rPr>
+        <w:t>Extension (optional)</w:t>
+      </w:r>
+    </w:p>
+    <w:p>
+      <w:pPr>
+        <w:keepLines/>
+      </w:pPr>
+      <w:r>
+        <w:rPr>
+          <w:b w:val="0"/>
+        </w:rPr>
+        <w:t>HTTP lab — apply your LAB HTTP Error rule to the HTTP trace from the Kurose &amp; Ross labs. Source: J.F. Kurose and K.W. Ross, Wireshark Labs (gaia.cs.umass.edu/kurose_ross/wireshark.php).</w:t>
+      </w:r>
+    </w:p>
+    <w:p>
+      <w:r>
+        <w:rPr>
+          <w:b/>
+          <w:color w:val="1F6FEB"/>
         </w:rPr>
         <w:t xml:space="preserve">Note: </w:t>
       </w:r>
@@ -3237,7 +3502,7 @@
         <w:rPr>
           <w:sz w:val="20"/>
         </w:rPr>
-        <w:t>Full commands are in labs/lab-04-*/README.md. Use the README in the matching labs/lab-NN-title/ folder. Capture only with permission.</w:t>
+        <w:t>Printable copy: labs/lab-04-color-and-annotate-evidence/LAB-04-Instructions.pdf. Use the README in the matching labs/lab-NN-title/ folder. Capture only with permission.</w:t>
       </w:r>
     </w:p>
     <w:p/>
@@ -3645,18 +3910,23 @@
           <w:color w:val="1F6FEB"/>
           <w:sz w:val="22"/>
         </w:rPr>
-        <w:t>Challenge</w:t>
+        <w:t>Try it with TShark</w:t>
       </w:r>
     </w:p>
     <w:p>
       <w:pPr>
         <w:keepLines/>
-      </w:pPr>
-      <w:r>
-        <w:rPr>
-          <w:b w:val="0"/>
-        </w:rPr>
-        <w:t>Develop and explain an alternative filter.</w:t>
+        <w:shd w:fill="EAF2FF"/>
+        <w:spacing w:before="80" w:after="60"/>
+        <w:ind w:left="200" w:right="200"/>
+      </w:pPr>
+      <w:r>
+        <w:rPr>
+          <w:rFonts w:ascii="Consolas" w:hAnsi="Consolas"/>
+          <w:color w:val="0B3060"/>
+          <w:sz w:val="19"/>
+        </w:rPr>
+        <w:t>tshark -n -r data/branch-office.pcap -Y "tcp.stream == 1 &amp;&amp; http.time" -T fields -e frame.number -e tcp.analysis.initial_rtt -e http.time</w:t>
       </w:r>
     </w:p>
     <w:p>
@@ -3666,7 +3936,7 @@
           <w:color w:val="1F6FEB"/>
           <w:sz w:val="22"/>
         </w:rPr>
-        <w:t>Reflection</w:t>
+        <w:t>Challenge</w:t>
       </w:r>
     </w:p>
     <w:p>
@@ -3677,7 +3947,7 @@
         <w:rPr>
           <w:b w:val="0"/>
         </w:rPr>
-        <w:t>Which second observation point would strengthen your conclusion?</w:t>
+        <w:t>Develop and explain an alternative filter.</w:t>
       </w:r>
     </w:p>
     <w:p>
@@ -3685,6 +3955,48 @@
         <w:rPr>
           <w:b/>
           <w:color w:val="1F6FEB"/>
+          <w:sz w:val="22"/>
+        </w:rPr>
+        <w:t>Reflection</w:t>
+      </w:r>
+    </w:p>
+    <w:p>
+      <w:pPr>
+        <w:keepLines/>
+      </w:pPr>
+      <w:r>
+        <w:rPr>
+          <w:b w:val="0"/>
+        </w:rPr>
+        <w:t>Which second observation point would strengthen your conclusion?</w:t>
+      </w:r>
+    </w:p>
+    <w:p>
+      <w:r>
+        <w:rPr>
+          <w:b/>
+          <w:color w:val="1F6FEB"/>
+          <w:sz w:val="22"/>
+        </w:rPr>
+        <w:t>Extension (optional)</w:t>
+      </w:r>
+    </w:p>
+    <w:p>
+      <w:pPr>
+        <w:keepLines/>
+      </w:pPr>
+      <w:r>
+        <w:rPr>
+          <w:b w:val="0"/>
+        </w:rPr>
+        <w:t>TCP lab — measure the initial RTT and response times in the TCP trace supplied with the Kurose &amp; Ross labs. Source: J.F. Kurose and K.W. Ross, Wireshark Labs (gaia.cs.umass.edu/kurose_ross/wireshark.php).</w:t>
+      </w:r>
+    </w:p>
+    <w:p>
+      <w:r>
+        <w:rPr>
+          <w:b/>
+          <w:color w:val="1F6FEB"/>
         </w:rPr>
         <w:t xml:space="preserve">Note: </w:t>
       </w:r>
@@ -3692,7 +4004,7 @@
         <w:rPr>
           <w:sz w:val="20"/>
         </w:rPr>
-        <w:t>Full commands are in labs/lab-05-*/README.md. Use the README in the matching labs/lab-NN-title/ folder. Capture only with permission.</w:t>
+        <w:t>Printable copy: labs/lab-05-separate-path-and-server-delay/LAB-05-Instructions.pdf. Use the README in the matching labs/lab-NN-title/ folder. Capture only with permission.</w:t>
       </w:r>
     </w:p>
     <w:p/>
@@ -4100,18 +4412,23 @@
           <w:color w:val="1F6FEB"/>
           <w:sz w:val="22"/>
         </w:rPr>
-        <w:t>Challenge</w:t>
+        <w:t>Try it with TShark</w:t>
       </w:r>
     </w:p>
     <w:p>
       <w:pPr>
         <w:keepLines/>
-      </w:pPr>
-      <w:r>
-        <w:rPr>
-          <w:b w:val="0"/>
-        </w:rPr>
-        <w:t>Develop and explain an alternative filter.</w:t>
+        <w:shd w:fill="EAF2FF"/>
+        <w:spacing w:before="80" w:after="60"/>
+        <w:ind w:left="200" w:right="200"/>
+      </w:pPr>
+      <w:r>
+        <w:rPr>
+          <w:rFonts w:ascii="Consolas" w:hAnsi="Consolas"/>
+          <w:color w:val="0B3060"/>
+          <w:sz w:val="19"/>
+        </w:rPr>
+        <w:t>tshark -n -r data/branch-office.pcap -q -z io,phs</w:t>
       </w:r>
     </w:p>
     <w:p>
@@ -4121,7 +4438,7 @@
           <w:color w:val="1F6FEB"/>
           <w:sz w:val="22"/>
         </w:rPr>
-        <w:t>Reflection</w:t>
+        <w:t>Challenge</w:t>
       </w:r>
     </w:p>
     <w:p>
@@ -4132,7 +4449,7 @@
         <w:rPr>
           <w:b w:val="0"/>
         </w:rPr>
-        <w:t>Which second observation point would strengthen your conclusion?</w:t>
+        <w:t>Develop and explain an alternative filter.</w:t>
       </w:r>
     </w:p>
     <w:p>
@@ -4140,6 +4457,48 @@
         <w:rPr>
           <w:b/>
           <w:color w:val="1F6FEB"/>
+          <w:sz w:val="22"/>
+        </w:rPr>
+        <w:t>Reflection</w:t>
+      </w:r>
+    </w:p>
+    <w:p>
+      <w:pPr>
+        <w:keepLines/>
+      </w:pPr>
+      <w:r>
+        <w:rPr>
+          <w:b w:val="0"/>
+        </w:rPr>
+        <w:t>Which second observation point would strengthen your conclusion?</w:t>
+      </w:r>
+    </w:p>
+    <w:p>
+      <w:r>
+        <w:rPr>
+          <w:b/>
+          <w:color w:val="1F6FEB"/>
+          <w:sz w:val="22"/>
+        </w:rPr>
+        <w:t>Extension (optional)</w:t>
+      </w:r>
+    </w:p>
+    <w:p>
+      <w:pPr>
+        <w:keepLines/>
+      </w:pPr>
+      <w:r>
+        <w:rPr>
+          <w:b w:val="0"/>
+        </w:rPr>
+        <w:t>Analyse a longer SIP/RTP call from the Wireshark sample captures (wiki.wireshark.org/SampleCaptures) with Telephony &gt; VoIP Calls.</w:t>
+      </w:r>
+    </w:p>
+    <w:p>
+      <w:r>
+        <w:rPr>
+          <w:b/>
+          <w:color w:val="1F6FEB"/>
         </w:rPr>
         <w:t xml:space="preserve">Note: </w:t>
       </w:r>
@@ -4147,7 +4506,7 @@
         <w:rPr>
           <w:sz w:val="20"/>
         </w:rPr>
-        <w:t>Full commands are in labs/lab-06-*/README.md. Use the README in the matching labs/lab-NN-title/ folder. Capture only with permission.</w:t>
+        <w:t>Printable copy: labs/lab-06-summarize-traffic-and-a-voice-stream/LAB-06-Instructions.pdf. Use the README in the matching labs/lab-NN-title/ folder. Capture only with permission.</w:t>
       </w:r>
     </w:p>
     <w:p/>
@@ -4555,18 +4914,23 @@
           <w:color w:val="1F6FEB"/>
           <w:sz w:val="22"/>
         </w:rPr>
-        <w:t>Challenge</w:t>
+        <w:t>Try it with TShark</w:t>
       </w:r>
     </w:p>
     <w:p>
       <w:pPr>
         <w:keepLines/>
-      </w:pPr>
-      <w:r>
-        <w:rPr>
-          <w:b w:val="0"/>
-        </w:rPr>
-        <w:t>Develop and explain an alternative filter.</w:t>
+        <w:shd w:fill="EAF2FF"/>
+        <w:spacing w:before="80" w:after="60"/>
+        <w:ind w:left="200" w:right="200"/>
+      </w:pPr>
+      <w:r>
+        <w:rPr>
+          <w:rFonts w:ascii="Consolas" w:hAnsi="Consolas"/>
+          <w:color w:val="0B3060"/>
+          <w:sz w:val="19"/>
+        </w:rPr>
+        <w:t>tshark -n -r data/branch-office.pcap -Y "dns.flags.rcode == 3"</w:t>
       </w:r>
     </w:p>
     <w:p>
@@ -4576,7 +4940,7 @@
           <w:color w:val="1F6FEB"/>
           <w:sz w:val="22"/>
         </w:rPr>
-        <w:t>Reflection</w:t>
+        <w:t>Challenge</w:t>
       </w:r>
     </w:p>
     <w:p>
@@ -4587,7 +4951,7 @@
         <w:rPr>
           <w:b w:val="0"/>
         </w:rPr>
-        <w:t>Which second observation point would strengthen your conclusion?</w:t>
+        <w:t>Develop and explain an alternative filter.</w:t>
       </w:r>
     </w:p>
     <w:p>
@@ -4595,6 +4959,48 @@
         <w:rPr>
           <w:b/>
           <w:color w:val="1F6FEB"/>
+          <w:sz w:val="22"/>
+        </w:rPr>
+        <w:t>Reflection</w:t>
+      </w:r>
+    </w:p>
+    <w:p>
+      <w:pPr>
+        <w:keepLines/>
+      </w:pPr>
+      <w:r>
+        <w:rPr>
+          <w:b w:val="0"/>
+        </w:rPr>
+        <w:t>Which second observation point would strengthen your conclusion?</w:t>
+      </w:r>
+    </w:p>
+    <w:p>
+      <w:r>
+        <w:rPr>
+          <w:b/>
+          <w:color w:val="1F6FEB"/>
+          <w:sz w:val="22"/>
+        </w:rPr>
+        <w:t>Extension (optional)</w:t>
+      </w:r>
+    </w:p>
+    <w:p>
+      <w:pPr>
+        <w:keepLines/>
+      </w:pPr>
+      <w:r>
+        <w:rPr>
+          <w:b w:val="0"/>
+        </w:rPr>
+        <w:t>Rewrite two of your matrix filters with the set (in {…}) and matches operators and confirm the frame lists are unchanged.</w:t>
+      </w:r>
+    </w:p>
+    <w:p>
+      <w:r>
+        <w:rPr>
+          <w:b/>
+          <w:color w:val="1F6FEB"/>
         </w:rPr>
         <w:t xml:space="preserve">Note: </w:t>
       </w:r>
@@ -4602,7 +5008,7 @@
         <w:rPr>
           <w:sz w:val="20"/>
         </w:rPr>
-        <w:t>Full commands are in labs/lab-07-*/README.md. Use the README in the matching labs/lab-NN-title/ folder. Capture only with permission.</w:t>
+        <w:t>Printable copy: labs/lab-07-build-a-filter-evidence-matrix/LAB-07-Instructions.pdf. Use the README in the matching labs/lab-NN-title/ folder. Capture only with permission.</w:t>
       </w:r>
     </w:p>
     <w:p/>
@@ -5010,18 +5416,23 @@
           <w:color w:val="1F6FEB"/>
           <w:sz w:val="22"/>
         </w:rPr>
-        <w:t>Challenge</w:t>
+        <w:t>Try it with TShark</w:t>
       </w:r>
     </w:p>
     <w:p>
       <w:pPr>
         <w:keepLines/>
-      </w:pPr>
-      <w:r>
-        <w:rPr>
-          <w:b w:val="0"/>
-        </w:rPr>
-        <w:t>Develop and explain an alternative filter.</w:t>
+        <w:shd w:fill="EAF2FF"/>
+        <w:spacing w:before="80" w:after="60"/>
+        <w:ind w:left="200" w:right="200"/>
+      </w:pPr>
+      <w:r>
+        <w:rPr>
+          <w:rFonts w:ascii="Consolas" w:hAnsi="Consolas"/>
+          <w:color w:val="0B3060"/>
+          <w:sz w:val="19"/>
+        </w:rPr>
+        <w:t>tshark -n -r data/branch-office.pcap -Y "arp || dns.id == 0x0065 || tcp.stream == 0"</w:t>
       </w:r>
     </w:p>
     <w:p>
@@ -5031,7 +5442,7 @@
           <w:color w:val="1F6FEB"/>
           <w:sz w:val="22"/>
         </w:rPr>
-        <w:t>Reflection</w:t>
+        <w:t>Challenge</w:t>
       </w:r>
     </w:p>
     <w:p>
@@ -5042,7 +5453,7 @@
         <w:rPr>
           <w:b w:val="0"/>
         </w:rPr>
-        <w:t>Which second observation point would strengthen your conclusion?</w:t>
+        <w:t>Develop and explain an alternative filter.</w:t>
       </w:r>
     </w:p>
     <w:p>
@@ -5050,6 +5461,48 @@
         <w:rPr>
           <w:b/>
           <w:color w:val="1F6FEB"/>
+          <w:sz w:val="22"/>
+        </w:rPr>
+        <w:t>Reflection</w:t>
+      </w:r>
+    </w:p>
+    <w:p>
+      <w:pPr>
+        <w:keepLines/>
+      </w:pPr>
+      <w:r>
+        <w:rPr>
+          <w:b w:val="0"/>
+        </w:rPr>
+        <w:t>Which second observation point would strengthen your conclusion?</w:t>
+      </w:r>
+    </w:p>
+    <w:p>
+      <w:r>
+        <w:rPr>
+          <w:b/>
+          <w:color w:val="1F6FEB"/>
+          <w:sz w:val="22"/>
+        </w:rPr>
+        <w:t>Extension (optional)</w:t>
+      </w:r>
+    </w:p>
+    <w:p>
+      <w:pPr>
+        <w:keepLines/>
+      </w:pPr>
+      <w:r>
+        <w:rPr>
+          <w:b w:val="0"/>
+        </w:rPr>
+        <w:t>Ethernet and ARP lab — trace the dependency chain for a page you load on an authorised network. Source: J.F. Kurose and K.W. Ross, Wireshark Labs (gaia.cs.umass.edu/kurose_ross/wireshark.php).</w:t>
+      </w:r>
+    </w:p>
+    <w:p>
+      <w:r>
+        <w:rPr>
+          <w:b/>
+          <w:color w:val="1F6FEB"/>
         </w:rPr>
         <w:t xml:space="preserve">Note: </w:t>
       </w:r>
@@ -5057,7 +5510,7 @@
         <w:rPr>
           <w:sz w:val="20"/>
         </w:rPr>
-        <w:t>Full commands are in labs/lab-08-*/README.md. Use the README in the matching labs/lab-NN-title/ folder. Capture only with permission.</w:t>
+        <w:t>Printable copy: labs/lab-08-reconstruct-an-application-dependency-chain/LAB-08-Instructions.pdf. Use the README in the matching labs/lab-NN-title/ folder. Capture only with permission.</w:t>
       </w:r>
     </w:p>
     <w:p/>
@@ -5465,18 +5918,23 @@
           <w:color w:val="1F6FEB"/>
           <w:sz w:val="22"/>
         </w:rPr>
-        <w:t>Challenge</w:t>
+        <w:t>Try it with TShark</w:t>
       </w:r>
     </w:p>
     <w:p>
       <w:pPr>
         <w:keepLines/>
-      </w:pPr>
-      <w:r>
-        <w:rPr>
-          <w:b w:val="0"/>
-        </w:rPr>
-        <w:t>Develop and explain an alternative filter.</w:t>
+        <w:shd w:fill="EAF2FF"/>
+        <w:spacing w:before="80" w:after="60"/>
+        <w:ind w:left="200" w:right="200"/>
+      </w:pPr>
+      <w:r>
+        <w:rPr>
+          <w:rFonts w:ascii="Consolas" w:hAnsi="Consolas"/>
+          <w:color w:val="0B3060"/>
+          <w:sz w:val="19"/>
+        </w:rPr>
+        <w:t>tshark -n -r data/branch-office.pcap -Y "dns.flags.response == 1" -T fields -e dns.id -e dns.qry.name -e dns.flags.rcode -e dns.time</w:t>
       </w:r>
     </w:p>
     <w:p>
@@ -5486,7 +5944,7 @@
           <w:color w:val="1F6FEB"/>
           <w:sz w:val="22"/>
         </w:rPr>
-        <w:t>Reflection</w:t>
+        <w:t>Challenge</w:t>
       </w:r>
     </w:p>
     <w:p>
@@ -5497,7 +5955,7 @@
         <w:rPr>
           <w:b w:val="0"/>
         </w:rPr>
-        <w:t>Which second observation point would strengthen your conclusion?</w:t>
+        <w:t>Develop and explain an alternative filter.</w:t>
       </w:r>
     </w:p>
     <w:p>
@@ -5505,6 +5963,48 @@
         <w:rPr>
           <w:b/>
           <w:color w:val="1F6FEB"/>
+          <w:sz w:val="22"/>
+        </w:rPr>
+        <w:t>Reflection</w:t>
+      </w:r>
+    </w:p>
+    <w:p>
+      <w:pPr>
+        <w:keepLines/>
+      </w:pPr>
+      <w:r>
+        <w:rPr>
+          <w:b w:val="0"/>
+        </w:rPr>
+        <w:t>Which second observation point would strengthen your conclusion?</w:t>
+      </w:r>
+    </w:p>
+    <w:p>
+      <w:r>
+        <w:rPr>
+          <w:b/>
+          <w:color w:val="1F6FEB"/>
+          <w:sz w:val="22"/>
+        </w:rPr>
+        <w:t>Extension (optional)</w:t>
+      </w:r>
+    </w:p>
+    <w:p>
+      <w:pPr>
+        <w:keepLines/>
+      </w:pPr>
+      <w:r>
+        <w:rPr>
+          <w:b w:val="0"/>
+        </w:rPr>
+        <w:t>DNS lab — compare A, NS and MX lookups in the DNS trace from the Kurose &amp; Ross labs. Source: J.F. Kurose and K.W. Ross, Wireshark Labs (gaia.cs.umass.edu/kurose_ross/wireshark.php).</w:t>
+      </w:r>
+    </w:p>
+    <w:p>
+      <w:r>
+        <w:rPr>
+          <w:b/>
+          <w:color w:val="1F6FEB"/>
         </w:rPr>
         <w:t xml:space="preserve">Note: </w:t>
       </w:r>
@@ -5512,7 +6012,7 @@
         <w:rPr>
           <w:sz w:val="20"/>
         </w:rPr>
-        <w:t>Full commands are in labs/lab-09-*/README.md. Use the README in the matching labs/lab-NN-title/ folder. Capture only with permission.</w:t>
+        <w:t>Printable copy: labs/lab-09-diagnose-dns-failure-and-delay/LAB-09-Instructions.pdf. Use the README in the matching labs/lab-NN-title/ folder. Capture only with permission.</w:t>
       </w:r>
     </w:p>
     <w:p/>
@@ -5868,18 +6368,23 @@
           <w:color w:val="1F6FEB"/>
           <w:sz w:val="22"/>
         </w:rPr>
-        <w:t>Challenge</w:t>
+        <w:t>Try it with TShark</w:t>
       </w:r>
     </w:p>
     <w:p>
       <w:pPr>
         <w:keepLines/>
-      </w:pPr>
-      <w:r>
-        <w:rPr>
-          <w:b w:val="0"/>
-        </w:rPr>
-        <w:t>Develop and explain an alternative filter.</w:t>
+        <w:shd w:fill="EAF2FF"/>
+        <w:spacing w:before="80" w:after="60"/>
+        <w:ind w:left="200" w:right="200"/>
+      </w:pPr>
+      <w:r>
+        <w:rPr>
+          <w:rFonts w:ascii="Consolas" w:hAnsi="Consolas"/>
+          <w:color w:val="0B3060"/>
+          <w:sz w:val="19"/>
+        </w:rPr>
+        <w:t>tshark -n -r data/branch-office.pcap -Y arp -T fields -e arp.opcode -e arp.src.proto_ipv4 -e arp.src.hw_mac</w:t>
       </w:r>
     </w:p>
     <w:p>
@@ -5889,7 +6394,7 @@
           <w:color w:val="1F6FEB"/>
           <w:sz w:val="22"/>
         </w:rPr>
-        <w:t>Reflection</w:t>
+        <w:t>Challenge</w:t>
       </w:r>
     </w:p>
     <w:p>
@@ -5900,7 +6405,7 @@
         <w:rPr>
           <w:b w:val="0"/>
         </w:rPr>
-        <w:t>Which second observation point would strengthen your conclusion?</w:t>
+        <w:t>Develop and explain an alternative filter.</w:t>
       </w:r>
     </w:p>
     <w:p>
@@ -5908,6 +6413,48 @@
         <w:rPr>
           <w:b/>
           <w:color w:val="1F6FEB"/>
+          <w:sz w:val="22"/>
+        </w:rPr>
+        <w:t>Reflection</w:t>
+      </w:r>
+    </w:p>
+    <w:p>
+      <w:pPr>
+        <w:keepLines/>
+      </w:pPr>
+      <w:r>
+        <w:rPr>
+          <w:b w:val="0"/>
+        </w:rPr>
+        <w:t>Which second observation point would strengthen your conclusion?</w:t>
+      </w:r>
+    </w:p>
+    <w:p>
+      <w:r>
+        <w:rPr>
+          <w:b/>
+          <w:color w:val="1F6FEB"/>
+          <w:sz w:val="22"/>
+        </w:rPr>
+        <w:t>Extension (optional)</w:t>
+      </w:r>
+    </w:p>
+    <w:p>
+      <w:pPr>
+        <w:keepLines/>
+      </w:pPr>
+      <w:r>
+        <w:rPr>
+          <w:b w:val="0"/>
+        </w:rPr>
+        <w:t>Ethernet and ARP lab — read the ARP cache on your own machine (arp -a) and match it to captured replies. Source: J.F. Kurose and K.W. Ross, Wireshark Labs (gaia.cs.umass.edu/kurose_ross/wireshark.php).</w:t>
+      </w:r>
+    </w:p>
+    <w:p>
+      <w:r>
+        <w:rPr>
+          <w:b/>
+          <w:color w:val="1F6FEB"/>
         </w:rPr>
         <w:t xml:space="preserve">Note: </w:t>
       </w:r>
@@ -5915,7 +6462,7 @@
         <w:rPr>
           <w:sz w:val="20"/>
         </w:rPr>
-        <w:t>Full commands are in labs/lab-10-*/README.md. Use the README in the matching labs/lab-NN-title/ folder. Capture only with permission.</w:t>
+        <w:t>Printable copy: labs/lab-10-verify-link-local-resolution/LAB-10-Instructions.pdf. Use the README in the matching labs/lab-NN-title/ folder. Capture only with permission.</w:t>
       </w:r>
     </w:p>
     <w:p/>
@@ -6323,18 +6870,23 @@
           <w:color w:val="1F6FEB"/>
           <w:sz w:val="22"/>
         </w:rPr>
-        <w:t>Challenge</w:t>
+        <w:t>Try it with TShark</w:t>
       </w:r>
     </w:p>
     <w:p>
       <w:pPr>
         <w:keepLines/>
-      </w:pPr>
-      <w:r>
-        <w:rPr>
-          <w:b w:val="0"/>
-        </w:rPr>
-        <w:t>Develop and explain an alternative filter.</w:t>
+        <w:shd w:fill="EAF2FF"/>
+        <w:spacing w:before="80" w:after="60"/>
+        <w:ind w:left="200" w:right="200"/>
+      </w:pPr>
+      <w:r>
+        <w:rPr>
+          <w:rFonts w:ascii="Consolas" w:hAnsi="Consolas"/>
+          <w:color w:val="0B3060"/>
+          <w:sz w:val="19"/>
+        </w:rPr>
+        <w:t>tshark -n -r data/branch-office.pcap -Y "ip.dst == 224.0.0.1" -T fields -e eth.dst -e ip.dst -e ip.ttl</w:t>
       </w:r>
     </w:p>
     <w:p>
@@ -6344,7 +6896,7 @@
           <w:color w:val="1F6FEB"/>
           <w:sz w:val="22"/>
         </w:rPr>
-        <w:t>Reflection</w:t>
+        <w:t>Challenge</w:t>
       </w:r>
     </w:p>
     <w:p>
@@ -6355,44 +6907,7 @@
         <w:rPr>
           <w:b w:val="0"/>
         </w:rPr>
-        <w:t>Which second observation point would strengthen your conclusion?</w:t>
-      </w:r>
-    </w:p>
-    <w:p>
-      <w:r>
-        <w:rPr>
-          <w:b/>
-          <w:color w:val="1F6FEB"/>
-        </w:rPr>
-        <w:t xml:space="preserve">Note: </w:t>
-      </w:r>
-      <w:r>
-        <w:rPr>
-          <w:sz w:val="20"/>
-        </w:rPr>
-        <w:t>Full commands are in labs/lab-11-*/README.md. Use the README in the matching labs/lab-NN-title/ folder. Capture only with permission.</w:t>
-      </w:r>
-    </w:p>
-    <w:p/>
-    <w:p>
-      <w:pPr>
-        <w:pStyle w:val="Heading1"/>
-        <w:keepNext/>
-      </w:pPr>
-      <w:r>
-        <w:t>Topic 12 — ICMP Traffic Analysis</w:t>
-      </w:r>
-    </w:p>
-    <w:p>
-      <w:pPr>
-        <w:keepNext/>
-        <w:keepLines/>
-      </w:pPr>
-      <w:r>
-        <w:rPr>
-          <w:b w:val="0"/>
-        </w:rPr>
-        <w:t>Interpret echo and unreachable messages</w:t>
+        <w:t>Develop and explain an alternative filter.</w:t>
       </w:r>
     </w:p>
     <w:p>
@@ -6402,6 +6917,85 @@
           <w:color w:val="1F6FEB"/>
           <w:sz w:val="22"/>
         </w:rPr>
+        <w:t>Reflection</w:t>
+      </w:r>
+    </w:p>
+    <w:p>
+      <w:pPr>
+        <w:keepLines/>
+      </w:pPr>
+      <w:r>
+        <w:rPr>
+          <w:b w:val="0"/>
+        </w:rPr>
+        <w:t>Which second observation point would strengthen your conclusion?</w:t>
+      </w:r>
+    </w:p>
+    <w:p>
+      <w:r>
+        <w:rPr>
+          <w:b/>
+          <w:color w:val="1F6FEB"/>
+          <w:sz w:val="22"/>
+        </w:rPr>
+        <w:t>Extension (optional)</w:t>
+      </w:r>
+    </w:p>
+    <w:p>
+      <w:pPr>
+        <w:keepLines/>
+      </w:pPr>
+      <w:r>
+        <w:rPr>
+          <w:b w:val="0"/>
+        </w:rPr>
+        <w:t>IP lab — study TTL and fragmentation in the traceroute trace from the Kurose &amp; Ross labs. Source: J.F. Kurose and K.W. Ross, Wireshark Labs (gaia.cs.umass.edu/kurose_ross/wireshark.php).</w:t>
+      </w:r>
+    </w:p>
+    <w:p>
+      <w:r>
+        <w:rPr>
+          <w:b/>
+          <w:color w:val="1F6FEB"/>
+        </w:rPr>
+        <w:t xml:space="preserve">Note: </w:t>
+      </w:r>
+      <w:r>
+        <w:rPr>
+          <w:sz w:val="20"/>
+        </w:rPr>
+        <w:t>Printable copy: labs/lab-11-classify-ipv4-scope-and-headers/LAB-11-Instructions.pdf. Use the README in the matching labs/lab-NN-title/ folder. Capture only with permission.</w:t>
+      </w:r>
+    </w:p>
+    <w:p/>
+    <w:p>
+      <w:pPr>
+        <w:pStyle w:val="Heading1"/>
+        <w:keepNext/>
+      </w:pPr>
+      <w:r>
+        <w:t>Topic 12 — ICMP Traffic Analysis</w:t>
+      </w:r>
+    </w:p>
+    <w:p>
+      <w:pPr>
+        <w:keepNext/>
+        <w:keepLines/>
+      </w:pPr>
+      <w:r>
+        <w:rPr>
+          <w:b w:val="0"/>
+        </w:rPr>
+        <w:t>Interpret echo and unreachable messages</w:t>
+      </w:r>
+    </w:p>
+    <w:p>
+      <w:r>
+        <w:rPr>
+          <w:b/>
+          <w:color w:val="1F6FEB"/>
+          <w:sz w:val="22"/>
+        </w:rPr>
         <w:t>Key concepts</w:t>
       </w:r>
     </w:p>
@@ -6427,6 +7021,58 @@
       </w:pPr>
       <w:r>
         <w:t>ICMP may be filtered or rate-limited, so absence of a reply needs cautious interpretation.</w:t>
+      </w:r>
+    </w:p>
+    <w:p>
+      <w:pPr>
+        <w:jc w:val="center"/>
+      </w:pPr>
+      <w:r>
+        <w:drawing>
+          <wp:inline xmlns:a="http://schemas.openxmlformats.org/drawingml/2006/main" xmlns:pic="http://schemas.openxmlformats.org/drawingml/2006/picture">
+            <wp:extent cx="5760720" cy="3824057"/>
+            <wp:docPr id="23" name="Picture 23"/>
+            <wp:cNvGraphicFramePr>
+              <a:graphicFrameLocks noChangeAspect="1"/>
+            </wp:cNvGraphicFramePr>
+            <a:graphic>
+              <a:graphicData uri="http://schemas.openxmlformats.org/drawingml/2006/picture">
+                <pic:pic>
+                  <pic:nvPicPr>
+                    <pic:cNvPr id="0" name="ladder-icmp-udp.png"/>
+                    <pic:cNvPicPr/>
+                  </pic:nvPicPr>
+                  <pic:blipFill>
+                    <a:blip r:embed="rId30"/>
+                    <a:stretch>
+                      <a:fillRect/>
+                    </a:stretch>
+                  </pic:blipFill>
+                  <pic:spPr>
+                    <a:xfrm>
+                      <a:off x="0" y="0"/>
+                      <a:ext cx="5760720" cy="3824057"/>
+                    </a:xfrm>
+                    <a:prstGeom prst="rect"/>
+                  </pic:spPr>
+                </pic:pic>
+              </a:graphicData>
+            </a:graphic>
+          </wp:inline>
+        </w:drawing>
+      </w:r>
+    </w:p>
+    <w:p>
+      <w:pPr>
+        <w:jc w:val="center"/>
+      </w:pPr>
+      <w:r>
+        <w:rPr>
+          <w:i/>
+          <w:color w:val="555B66"/>
+          <w:sz w:val="18"/>
+        </w:rPr>
+        <w:t>Echo, Refusal and Reset in the Lab Capture — Frames 9–16 and 55–56</w:t>
       </w:r>
     </w:p>
     <w:p>
@@ -6654,7 +7300,7 @@
         <w:drawing>
           <wp:inline xmlns:a="http://schemas.openxmlformats.org/drawingml/2006/main" xmlns:pic="http://schemas.openxmlformats.org/drawingml/2006/picture">
             <wp:extent cx="5760720" cy="643845"/>
-            <wp:docPr id="23" name="Picture 23"/>
+            <wp:docPr id="24" name="Picture 24"/>
             <wp:cNvGraphicFramePr>
               <a:graphicFrameLocks noChangeAspect="1"/>
             </wp:cNvGraphicFramePr>
@@ -6666,7 +7312,7 @@
                     <pic:cNvPicPr/>
                   </pic:nvPicPr>
                   <pic:blipFill>
-                    <a:blip r:embed="rId30"/>
+                    <a:blip r:embed="rId31"/>
                     <a:stretch>
                       <a:fillRect/>
                     </a:stretch>
@@ -6726,18 +7372,23 @@
           <w:color w:val="1F6FEB"/>
           <w:sz w:val="22"/>
         </w:rPr>
-        <w:t>Challenge</w:t>
+        <w:t>Try it with TShark</w:t>
       </w:r>
     </w:p>
     <w:p>
       <w:pPr>
         <w:keepLines/>
-      </w:pPr>
-      <w:r>
-        <w:rPr>
-          <w:b w:val="0"/>
-        </w:rPr>
-        <w:t>Develop and explain an alternative filter.</w:t>
+        <w:shd w:fill="EAF2FF"/>
+        <w:spacing w:before="80" w:after="60"/>
+        <w:ind w:left="200" w:right="200"/>
+      </w:pPr>
+      <w:r>
+        <w:rPr>
+          <w:rFonts w:ascii="Consolas" w:hAnsi="Consolas"/>
+          <w:color w:val="0B3060"/>
+          <w:sz w:val="19"/>
+        </w:rPr>
+        <w:t>tshark -n -r data/branch-office.pcap -Y icmp -T fields -e frame.number -e icmp.type -e icmp.code -e icmp.seq</w:t>
       </w:r>
     </w:p>
     <w:p>
@@ -6747,7 +7398,7 @@
           <w:color w:val="1F6FEB"/>
           <w:sz w:val="22"/>
         </w:rPr>
-        <w:t>Reflection</w:t>
+        <w:t>Challenge</w:t>
       </w:r>
     </w:p>
     <w:p>
@@ -6758,44 +7409,7 @@
         <w:rPr>
           <w:b w:val="0"/>
         </w:rPr>
-        <w:t>Which second observation point would strengthen your conclusion?</w:t>
-      </w:r>
-    </w:p>
-    <w:p>
-      <w:r>
-        <w:rPr>
-          <w:b/>
-          <w:color w:val="1F6FEB"/>
-        </w:rPr>
-        <w:t xml:space="preserve">Note: </w:t>
-      </w:r>
-      <w:r>
-        <w:rPr>
-          <w:sz w:val="20"/>
-        </w:rPr>
-        <w:t>Full commands are in labs/lab-12-*/README.md. Use the README in the matching labs/lab-NN-title/ folder. Capture only with permission.</w:t>
-      </w:r>
-    </w:p>
-    <w:p/>
-    <w:p>
-      <w:pPr>
-        <w:pStyle w:val="Heading1"/>
-        <w:keepNext/>
-      </w:pPr>
-      <w:r>
-        <w:t>Topic 13 — UDP Traffic Analysis</w:t>
-      </w:r>
-    </w:p>
-    <w:p>
-      <w:pPr>
-        <w:keepNext/>
-        <w:keepLines/>
-      </w:pPr>
-      <w:r>
-        <w:rPr>
-          <w:b w:val="0"/>
-        </w:rPr>
-        <w:t>Follow datagrams and service refusal</w:t>
+        <w:t>Develop and explain an alternative filter.</w:t>
       </w:r>
     </w:p>
     <w:p>
@@ -6805,6 +7419,85 @@
           <w:color w:val="1F6FEB"/>
           <w:sz w:val="22"/>
         </w:rPr>
+        <w:t>Reflection</w:t>
+      </w:r>
+    </w:p>
+    <w:p>
+      <w:pPr>
+        <w:keepLines/>
+      </w:pPr>
+      <w:r>
+        <w:rPr>
+          <w:b w:val="0"/>
+        </w:rPr>
+        <w:t>Which second observation point would strengthen your conclusion?</w:t>
+      </w:r>
+    </w:p>
+    <w:p>
+      <w:r>
+        <w:rPr>
+          <w:b/>
+          <w:color w:val="1F6FEB"/>
+          <w:sz w:val="22"/>
+        </w:rPr>
+        <w:t>Extension (optional)</w:t>
+      </w:r>
+    </w:p>
+    <w:p>
+      <w:pPr>
+        <w:keepLines/>
+      </w:pPr>
+      <w:r>
+        <w:rPr>
+          <w:b w:val="0"/>
+        </w:rPr>
+        <w:t>ICMP lab — identify Time Exceeded (type 11) messages in the traceroute trace. Source: J.F. Kurose and K.W. Ross, Wireshark Labs (gaia.cs.umass.edu/kurose_ross/wireshark.php).</w:t>
+      </w:r>
+    </w:p>
+    <w:p>
+      <w:r>
+        <w:rPr>
+          <w:b/>
+          <w:color w:val="1F6FEB"/>
+        </w:rPr>
+        <w:t xml:space="preserve">Note: </w:t>
+      </w:r>
+      <w:r>
+        <w:rPr>
+          <w:sz w:val="20"/>
+        </w:rPr>
+        <w:t>Printable copy: labs/lab-12-interpret-echo-and-unreachable-messages/LAB-12-Instructions.pdf. Use the README in the matching labs/lab-NN-title/ folder. Capture only with permission.</w:t>
+      </w:r>
+    </w:p>
+    <w:p/>
+    <w:p>
+      <w:pPr>
+        <w:pStyle w:val="Heading1"/>
+        <w:keepNext/>
+      </w:pPr>
+      <w:r>
+        <w:t>Topic 13 — UDP Traffic Analysis</w:t>
+      </w:r>
+    </w:p>
+    <w:p>
+      <w:pPr>
+        <w:keepNext/>
+        <w:keepLines/>
+      </w:pPr>
+      <w:r>
+        <w:rPr>
+          <w:b w:val="0"/>
+        </w:rPr>
+        <w:t>Follow datagrams and service refusal</w:t>
+      </w:r>
+    </w:p>
+    <w:p>
+      <w:r>
+        <w:rPr>
+          <w:b/>
+          <w:color w:val="1F6FEB"/>
+          <w:sz w:val="22"/>
+        </w:rPr>
         <w:t>Key concepts</w:t>
       </w:r>
     </w:p>
@@ -6840,7 +7533,7 @@
         <w:drawing>
           <wp:inline xmlns:a="http://schemas.openxmlformats.org/drawingml/2006/main" xmlns:pic="http://schemas.openxmlformats.org/drawingml/2006/picture">
             <wp:extent cx="5760720" cy="2044126"/>
-            <wp:docPr id="24" name="Picture 24"/>
+            <wp:docPr id="25" name="Picture 25"/>
             <wp:cNvGraphicFramePr>
               <a:graphicFrameLocks noChangeAspect="1"/>
             </wp:cNvGraphicFramePr>
@@ -6852,7 +7545,7 @@
                     <pic:cNvPicPr/>
                   </pic:nvPicPr>
                   <pic:blipFill>
-                    <a:blip r:embed="rId31"/>
+                    <a:blip r:embed="rId32"/>
                     <a:stretch>
                       <a:fillRect/>
                     </a:stretch>
@@ -7109,7 +7802,7 @@
         <w:drawing>
           <wp:inline xmlns:a="http://schemas.openxmlformats.org/drawingml/2006/main" xmlns:pic="http://schemas.openxmlformats.org/drawingml/2006/picture">
             <wp:extent cx="5760720" cy="779392"/>
-            <wp:docPr id="25" name="Picture 25"/>
+            <wp:docPr id="26" name="Picture 26"/>
             <wp:cNvGraphicFramePr>
               <a:graphicFrameLocks noChangeAspect="1"/>
             </wp:cNvGraphicFramePr>
@@ -7121,7 +7814,7 @@
                     <pic:cNvPicPr/>
                   </pic:nvPicPr>
                   <pic:blipFill>
-                    <a:blip r:embed="rId32"/>
+                    <a:blip r:embed="rId33"/>
                     <a:stretch>
                       <a:fillRect/>
                     </a:stretch>
@@ -7181,18 +7874,23 @@
           <w:color w:val="1F6FEB"/>
           <w:sz w:val="22"/>
         </w:rPr>
-        <w:t>Challenge</w:t>
+        <w:t>Try it with TShark</w:t>
       </w:r>
     </w:p>
     <w:p>
       <w:pPr>
         <w:keepLines/>
-      </w:pPr>
-      <w:r>
-        <w:rPr>
-          <w:b w:val="0"/>
-        </w:rPr>
-        <w:t>Develop and explain an alternative filter.</w:t>
+        <w:shd w:fill="EAF2FF"/>
+        <w:spacing w:before="80" w:after="60"/>
+        <w:ind w:left="200" w:right="200"/>
+      </w:pPr>
+      <w:r>
+        <w:rPr>
+          <w:rFonts w:ascii="Consolas" w:hAnsi="Consolas"/>
+          <w:color w:val="0B3060"/>
+          <w:sz w:val="19"/>
+        </w:rPr>
+        <w:t>tshark -n -r data/branch-office.pcap -q -z follow,udp,ascii,3</w:t>
       </w:r>
     </w:p>
     <w:p>
@@ -7202,7 +7900,7 @@
           <w:color w:val="1F6FEB"/>
           <w:sz w:val="22"/>
         </w:rPr>
-        <w:t>Reflection</w:t>
+        <w:t>Challenge</w:t>
       </w:r>
     </w:p>
     <w:p>
@@ -7213,44 +7911,7 @@
         <w:rPr>
           <w:b w:val="0"/>
         </w:rPr>
-        <w:t>Which second observation point would strengthen your conclusion?</w:t>
-      </w:r>
-    </w:p>
-    <w:p>
-      <w:r>
-        <w:rPr>
-          <w:b/>
-          <w:color w:val="1F6FEB"/>
-        </w:rPr>
-        <w:t xml:space="preserve">Note: </w:t>
-      </w:r>
-      <w:r>
-        <w:rPr>
-          <w:sz w:val="20"/>
-        </w:rPr>
-        <w:t>Full commands are in labs/lab-13-*/README.md. Use the README in the matching labs/lab-NN-title/ folder. Capture only with permission.</w:t>
-      </w:r>
-    </w:p>
-    <w:p/>
-    <w:p>
-      <w:pPr>
-        <w:pStyle w:val="Heading1"/>
-        <w:keepNext/>
-      </w:pPr>
-      <w:r>
-        <w:t>Topic 14 — TCP Protocol Analysis</w:t>
-      </w:r>
-    </w:p>
-    <w:p>
-      <w:pPr>
-        <w:keepNext/>
-        <w:keepLines/>
-      </w:pPr>
-      <w:r>
-        <w:rPr>
-          <w:b w:val="0"/>
-        </w:rPr>
-        <w:t>Investigate retransmission and zero window</w:t>
+        <w:t>Develop and explain an alternative filter.</w:t>
       </w:r>
     </w:p>
     <w:p>
@@ -7260,6 +7921,85 @@
           <w:color w:val="1F6FEB"/>
           <w:sz w:val="22"/>
         </w:rPr>
+        <w:t>Reflection</w:t>
+      </w:r>
+    </w:p>
+    <w:p>
+      <w:pPr>
+        <w:keepLines/>
+      </w:pPr>
+      <w:r>
+        <w:rPr>
+          <w:b w:val="0"/>
+        </w:rPr>
+        <w:t>Which second observation point would strengthen your conclusion?</w:t>
+      </w:r>
+    </w:p>
+    <w:p>
+      <w:r>
+        <w:rPr>
+          <w:b/>
+          <w:color w:val="1F6FEB"/>
+          <w:sz w:val="22"/>
+        </w:rPr>
+        <w:t>Extension (optional)</w:t>
+      </w:r>
+    </w:p>
+    <w:p>
+      <w:pPr>
+        <w:keepLines/>
+      </w:pPr>
+      <w:r>
+        <w:rPr>
+          <w:b w:val="0"/>
+        </w:rPr>
+        <w:t>UDP lab — examine UDP header fields and lengths in the UDP trace from the Kurose &amp; Ross labs. Source: J.F. Kurose and K.W. Ross, Wireshark Labs (gaia.cs.umass.edu/kurose_ross/wireshark.php).</w:t>
+      </w:r>
+    </w:p>
+    <w:p>
+      <w:r>
+        <w:rPr>
+          <w:b/>
+          <w:color w:val="1F6FEB"/>
+        </w:rPr>
+        <w:t xml:space="preserve">Note: </w:t>
+      </w:r>
+      <w:r>
+        <w:rPr>
+          <w:sz w:val="20"/>
+        </w:rPr>
+        <w:t>Printable copy: labs/lab-13-follow-datagrams-and-service-refusal/LAB-13-Instructions.pdf. Use the README in the matching labs/lab-NN-title/ folder. Capture only with permission.</w:t>
+      </w:r>
+    </w:p>
+    <w:p/>
+    <w:p>
+      <w:pPr>
+        <w:pStyle w:val="Heading1"/>
+        <w:keepNext/>
+      </w:pPr>
+      <w:r>
+        <w:t>Topic 14 — TCP Protocol Analysis</w:t>
+      </w:r>
+    </w:p>
+    <w:p>
+      <w:pPr>
+        <w:keepNext/>
+        <w:keepLines/>
+      </w:pPr>
+      <w:r>
+        <w:rPr>
+          <w:b w:val="0"/>
+        </w:rPr>
+        <w:t>Investigate retransmission and zero window</w:t>
+      </w:r>
+    </w:p>
+    <w:p>
+      <w:r>
+        <w:rPr>
+          <w:b/>
+          <w:color w:val="1F6FEB"/>
+          <w:sz w:val="22"/>
+        </w:rPr>
         <w:t>Key concepts</w:t>
       </w:r>
     </w:p>
@@ -7295,7 +8035,7 @@
         <w:drawing>
           <wp:inline xmlns:a="http://schemas.openxmlformats.org/drawingml/2006/main" xmlns:pic="http://schemas.openxmlformats.org/drawingml/2006/picture">
             <wp:extent cx="5760720" cy="2715139"/>
-            <wp:docPr id="26" name="Picture 26"/>
+            <wp:docPr id="27" name="Picture 27"/>
             <wp:cNvGraphicFramePr>
               <a:graphicFrameLocks noChangeAspect="1"/>
             </wp:cNvGraphicFramePr>
@@ -7307,7 +8047,7 @@
                     <pic:cNvPicPr/>
                   </pic:nvPicPr>
                   <pic:blipFill>
-                    <a:blip r:embed="rId33"/>
+                    <a:blip r:embed="rId34"/>
                     <a:stretch>
                       <a:fillRect/>
                     </a:stretch>
@@ -7564,7 +8304,7 @@
         <w:drawing>
           <wp:inline xmlns:a="http://schemas.openxmlformats.org/drawingml/2006/main" xmlns:pic="http://schemas.openxmlformats.org/drawingml/2006/picture">
             <wp:extent cx="5760720" cy="2033195"/>
-            <wp:docPr id="27" name="Picture 27"/>
+            <wp:docPr id="28" name="Picture 28"/>
             <wp:cNvGraphicFramePr>
               <a:graphicFrameLocks noChangeAspect="1"/>
             </wp:cNvGraphicFramePr>
@@ -7576,7 +8316,7 @@
                     <pic:cNvPicPr/>
                   </pic:nvPicPr>
                   <pic:blipFill>
-                    <a:blip r:embed="rId34"/>
+                    <a:blip r:embed="rId35"/>
                     <a:stretch>
                       <a:fillRect/>
                     </a:stretch>
@@ -7636,18 +8376,23 @@
           <w:color w:val="1F6FEB"/>
           <w:sz w:val="22"/>
         </w:rPr>
-        <w:t>Challenge</w:t>
+        <w:t>Try it with TShark</w:t>
       </w:r>
     </w:p>
     <w:p>
       <w:pPr>
         <w:keepLines/>
-      </w:pPr>
-      <w:r>
-        <w:rPr>
-          <w:b w:val="0"/>
-        </w:rPr>
-        <w:t>Develop and explain an alternative filter.</w:t>
+        <w:shd w:fill="EAF2FF"/>
+        <w:spacing w:before="80" w:after="60"/>
+        <w:ind w:left="200" w:right="200"/>
+      </w:pPr>
+      <w:r>
+        <w:rPr>
+          <w:rFonts w:ascii="Consolas" w:hAnsi="Consolas"/>
+          <w:color w:val="0B3060"/>
+          <w:sz w:val="19"/>
+        </w:rPr>
+        <w:t>tshark -n -r data/branch-office.pcap -q -z expert</w:t>
       </w:r>
     </w:p>
     <w:p>
@@ -7657,7 +8402,7 @@
           <w:color w:val="1F6FEB"/>
           <w:sz w:val="22"/>
         </w:rPr>
-        <w:t>Reflection</w:t>
+        <w:t>Challenge</w:t>
       </w:r>
     </w:p>
     <w:p>
@@ -7668,44 +8413,7 @@
         <w:rPr>
           <w:b w:val="0"/>
         </w:rPr>
-        <w:t>Which second observation point would strengthen your conclusion?</w:t>
-      </w:r>
-    </w:p>
-    <w:p>
-      <w:r>
-        <w:rPr>
-          <w:b/>
-          <w:color w:val="1F6FEB"/>
-        </w:rPr>
-        <w:t xml:space="preserve">Note: </w:t>
-      </w:r>
-      <w:r>
-        <w:rPr>
-          <w:sz w:val="20"/>
-        </w:rPr>
-        <w:t>Full commands are in labs/lab-14-*/README.md. Use the README in the matching labs/lab-NN-title/ folder. Capture only with permission.</w:t>
-      </w:r>
-    </w:p>
-    <w:p/>
-    <w:p>
-      <w:pPr>
-        <w:pStyle w:val="Heading1"/>
-        <w:keepNext/>
-      </w:pPr>
-      <w:r>
-        <w:t>Topic 15 — Traffic Graphs</w:t>
-      </w:r>
-    </w:p>
-    <w:p>
-      <w:pPr>
-        <w:keepNext/>
-        <w:keepLines/>
-      </w:pPr>
-      <w:r>
-        <w:rPr>
-          <w:b w:val="0"/>
-        </w:rPr>
-        <w:t>Graph bytes, RTT and recovery</w:t>
+        <w:t>Develop and explain an alternative filter.</w:t>
       </w:r>
     </w:p>
     <w:p>
@@ -7715,6 +8423,85 @@
           <w:color w:val="1F6FEB"/>
           <w:sz w:val="22"/>
         </w:rPr>
+        <w:t>Reflection</w:t>
+      </w:r>
+    </w:p>
+    <w:p>
+      <w:pPr>
+        <w:keepLines/>
+      </w:pPr>
+      <w:r>
+        <w:rPr>
+          <w:b w:val="0"/>
+        </w:rPr>
+        <w:t>Which second observation point would strengthen your conclusion?</w:t>
+      </w:r>
+    </w:p>
+    <w:p>
+      <w:r>
+        <w:rPr>
+          <w:b/>
+          <w:color w:val="1F6FEB"/>
+          <w:sz w:val="22"/>
+        </w:rPr>
+        <w:t>Extension (optional)</w:t>
+      </w:r>
+    </w:p>
+    <w:p>
+      <w:pPr>
+        <w:keepLines/>
+      </w:pPr>
+      <w:r>
+        <w:rPr>
+          <w:b w:val="0"/>
+        </w:rPr>
+        <w:t>TCP lab — find retransmissions and window behaviour in a larger file transfer trace. Source: J.F. Kurose and K.W. Ross, Wireshark Labs (gaia.cs.umass.edu/kurose_ross/wireshark.php).</w:t>
+      </w:r>
+    </w:p>
+    <w:p>
+      <w:r>
+        <w:rPr>
+          <w:b/>
+          <w:color w:val="1F6FEB"/>
+        </w:rPr>
+        <w:t xml:space="preserve">Note: </w:t>
+      </w:r>
+      <w:r>
+        <w:rPr>
+          <w:sz w:val="20"/>
+        </w:rPr>
+        <w:t>Printable copy: labs/lab-14-investigate-retransmission-and-zero-window/LAB-14-Instructions.pdf. Use the README in the matching labs/lab-NN-title/ folder. Capture only with permission.</w:t>
+      </w:r>
+    </w:p>
+    <w:p/>
+    <w:p>
+      <w:pPr>
+        <w:pStyle w:val="Heading1"/>
+        <w:keepNext/>
+      </w:pPr>
+      <w:r>
+        <w:t>Topic 15 — Traffic Graphs</w:t>
+      </w:r>
+    </w:p>
+    <w:p>
+      <w:pPr>
+        <w:keepNext/>
+        <w:keepLines/>
+      </w:pPr>
+      <w:r>
+        <w:rPr>
+          <w:b w:val="0"/>
+        </w:rPr>
+        <w:t>Graph bytes, RTT and recovery</w:t>
+      </w:r>
+    </w:p>
+    <w:p>
+      <w:r>
+        <w:rPr>
+          <w:b/>
+          <w:color w:val="1F6FEB"/>
+          <w:sz w:val="22"/>
+        </w:rPr>
         <w:t>Key concepts</w:t>
       </w:r>
     </w:p>
@@ -7750,7 +8537,7 @@
         <w:drawing>
           <wp:inline xmlns:a="http://schemas.openxmlformats.org/drawingml/2006/main" xmlns:pic="http://schemas.openxmlformats.org/drawingml/2006/picture">
             <wp:extent cx="5760720" cy="2300765"/>
-            <wp:docPr id="28" name="Picture 28"/>
+            <wp:docPr id="29" name="Picture 29"/>
             <wp:cNvGraphicFramePr>
               <a:graphicFrameLocks noChangeAspect="1"/>
             </wp:cNvGraphicFramePr>
@@ -7762,7 +8549,7 @@
                     <pic:cNvPicPr/>
                   </pic:nvPicPr>
                   <pic:blipFill>
-                    <a:blip r:embed="rId35"/>
+                    <a:blip r:embed="rId36"/>
                     <a:stretch>
                       <a:fillRect/>
                     </a:stretch>
@@ -8019,7 +8806,7 @@
         <w:drawing>
           <wp:inline xmlns:a="http://schemas.openxmlformats.org/drawingml/2006/main" xmlns:pic="http://schemas.openxmlformats.org/drawingml/2006/picture">
             <wp:extent cx="5760720" cy="779392"/>
-            <wp:docPr id="29" name="Picture 29"/>
+            <wp:docPr id="30" name="Picture 30"/>
             <wp:cNvGraphicFramePr>
               <a:graphicFrameLocks noChangeAspect="1"/>
             </wp:cNvGraphicFramePr>
@@ -8031,7 +8818,7 @@
                     <pic:cNvPicPr/>
                   </pic:nvPicPr>
                   <pic:blipFill>
-                    <a:blip r:embed="rId36"/>
+                    <a:blip r:embed="rId37"/>
                     <a:stretch>
                       <a:fillRect/>
                     </a:stretch>
@@ -8091,18 +8878,23 @@
           <w:color w:val="1F6FEB"/>
           <w:sz w:val="22"/>
         </w:rPr>
-        <w:t>Challenge</w:t>
+        <w:t>Try it with TShark</w:t>
       </w:r>
     </w:p>
     <w:p>
       <w:pPr>
         <w:keepLines/>
-      </w:pPr>
-      <w:r>
-        <w:rPr>
-          <w:b w:val="0"/>
-        </w:rPr>
-        <w:t>Develop and explain an alternative filter.</w:t>
+        <w:shd w:fill="EAF2FF"/>
+        <w:spacing w:before="80" w:after="60"/>
+        <w:ind w:left="200" w:right="200"/>
+      </w:pPr>
+      <w:r>
+        <w:rPr>
+          <w:rFonts w:ascii="Consolas" w:hAnsi="Consolas"/>
+          <w:color w:val="0B3060"/>
+          <w:sz w:val="19"/>
+        </w:rPr>
+        <w:t>tshark -n -r data/branch-office.pcap -q -z "io,stat,1,tcp.analysis.retransmission,tcp.analysis.zero_window"</w:t>
       </w:r>
     </w:p>
     <w:p>
@@ -8112,7 +8904,7 @@
           <w:color w:val="1F6FEB"/>
           <w:sz w:val="22"/>
         </w:rPr>
-        <w:t>Reflection</w:t>
+        <w:t>Challenge</w:t>
       </w:r>
     </w:p>
     <w:p>
@@ -8123,44 +8915,7 @@
         <w:rPr>
           <w:b w:val="0"/>
         </w:rPr>
-        <w:t>Which second observation point would strengthen your conclusion?</w:t>
-      </w:r>
-    </w:p>
-    <w:p>
-      <w:r>
-        <w:rPr>
-          <w:b/>
-          <w:color w:val="1F6FEB"/>
-        </w:rPr>
-        <w:t xml:space="preserve">Note: </w:t>
-      </w:r>
-      <w:r>
-        <w:rPr>
-          <w:sz w:val="20"/>
-        </w:rPr>
-        <w:t>Full commands are in labs/lab-15-*/README.md. Use the README in the matching labs/lab-NN-title/ folder. Capture only with permission.</w:t>
-      </w:r>
-    </w:p>
-    <w:p/>
-    <w:p>
-      <w:pPr>
-        <w:pStyle w:val="Heading1"/>
-        <w:keepNext/>
-      </w:pPr>
-      <w:r>
-        <w:t>Topic 16 — HTTP and HTTP/2 Analysis</w:t>
-      </w:r>
-    </w:p>
-    <w:p>
-      <w:pPr>
-        <w:keepNext/>
-        <w:keepLines/>
-      </w:pPr>
-      <w:r>
-        <w:rPr>
-          <w:b w:val="0"/>
-        </w:rPr>
-        <w:t>Inspect HTTP outcomes and HTTP/2 frames</w:t>
+        <w:t>Develop and explain an alternative filter.</w:t>
       </w:r>
     </w:p>
     <w:p>
@@ -8170,6 +8925,85 @@
           <w:color w:val="1F6FEB"/>
           <w:sz w:val="22"/>
         </w:rPr>
+        <w:t>Reflection</w:t>
+      </w:r>
+    </w:p>
+    <w:p>
+      <w:pPr>
+        <w:keepLines/>
+      </w:pPr>
+      <w:r>
+        <w:rPr>
+          <w:b w:val="0"/>
+        </w:rPr>
+        <w:t>Which second observation point would strengthen your conclusion?</w:t>
+      </w:r>
+    </w:p>
+    <w:p>
+      <w:r>
+        <w:rPr>
+          <w:b/>
+          <w:color w:val="1F6FEB"/>
+          <w:sz w:val="22"/>
+        </w:rPr>
+        <w:t>Extension (optional)</w:t>
+      </w:r>
+    </w:p>
+    <w:p>
+      <w:pPr>
+        <w:keepLines/>
+      </w:pPr>
+      <w:r>
+        <w:rPr>
+          <w:b w:val="0"/>
+        </w:rPr>
+        <w:t>TCP lab — draw the Stevens graph of the file upload trace and estimate throughput. Source: J.F. Kurose and K.W. Ross, Wireshark Labs (gaia.cs.umass.edu/kurose_ross/wireshark.php).</w:t>
+      </w:r>
+    </w:p>
+    <w:p>
+      <w:r>
+        <w:rPr>
+          <w:b/>
+          <w:color w:val="1F6FEB"/>
+        </w:rPr>
+        <w:t xml:space="preserve">Note: </w:t>
+      </w:r>
+      <w:r>
+        <w:rPr>
+          <w:sz w:val="20"/>
+        </w:rPr>
+        <w:t>Printable copy: labs/lab-15-graph-bytes-rtt-and-recovery/LAB-15-Instructions.pdf. Use the README in the matching labs/lab-NN-title/ folder. Capture only with permission.</w:t>
+      </w:r>
+    </w:p>
+    <w:p/>
+    <w:p>
+      <w:pPr>
+        <w:pStyle w:val="Heading1"/>
+        <w:keepNext/>
+      </w:pPr>
+      <w:r>
+        <w:t>Topic 16 — HTTP and HTTP/2 Analysis</w:t>
+      </w:r>
+    </w:p>
+    <w:p>
+      <w:pPr>
+        <w:keepNext/>
+        <w:keepLines/>
+      </w:pPr>
+      <w:r>
+        <w:rPr>
+          <w:b w:val="0"/>
+        </w:rPr>
+        <w:t>Inspect HTTP outcomes and HTTP/2 frames</w:t>
+      </w:r>
+    </w:p>
+    <w:p>
+      <w:r>
+        <w:rPr>
+          <w:b/>
+          <w:color w:val="1F6FEB"/>
+          <w:sz w:val="22"/>
+        </w:rPr>
         <w:t>Key concepts</w:t>
       </w:r>
     </w:p>
@@ -8205,7 +9039,7 @@
         <w:drawing>
           <wp:inline xmlns:a="http://schemas.openxmlformats.org/drawingml/2006/main" xmlns:pic="http://schemas.openxmlformats.org/drawingml/2006/picture">
             <wp:extent cx="5731011" cy="3840480"/>
-            <wp:docPr id="30" name="Picture 30"/>
+            <wp:docPr id="31" name="Picture 31"/>
             <wp:cNvGraphicFramePr>
               <a:graphicFrameLocks noChangeAspect="1"/>
             </wp:cNvGraphicFramePr>
@@ -8217,7 +9051,7 @@
                     <pic:cNvPicPr/>
                   </pic:nvPicPr>
                   <pic:blipFill>
-                    <a:blip r:embed="rId37"/>
+                    <a:blip r:embed="rId38"/>
                     <a:stretch>
                       <a:fillRect/>
                     </a:stretch>
@@ -8474,7 +9308,7 @@
         <w:drawing>
           <wp:inline xmlns:a="http://schemas.openxmlformats.org/drawingml/2006/main" xmlns:pic="http://schemas.openxmlformats.org/drawingml/2006/picture">
             <wp:extent cx="5760720" cy="1474067"/>
-            <wp:docPr id="31" name="Picture 31"/>
+            <wp:docPr id="32" name="Picture 32"/>
             <wp:cNvGraphicFramePr>
               <a:graphicFrameLocks noChangeAspect="1"/>
             </wp:cNvGraphicFramePr>
@@ -8486,7 +9320,7 @@
                     <pic:cNvPicPr/>
                   </pic:nvPicPr>
                   <pic:blipFill>
-                    <a:blip r:embed="rId38"/>
+                    <a:blip r:embed="rId39"/>
                     <a:stretch>
                       <a:fillRect/>
                     </a:stretch>
@@ -8546,18 +9380,23 @@
           <w:color w:val="1F6FEB"/>
           <w:sz w:val="22"/>
         </w:rPr>
-        <w:t>Challenge</w:t>
+        <w:t>Try it with TShark</w:t>
       </w:r>
     </w:p>
     <w:p>
       <w:pPr>
         <w:keepLines/>
-      </w:pPr>
-      <w:r>
-        <w:rPr>
-          <w:b w:val="0"/>
-        </w:rPr>
-        <w:t>Develop and explain an alternative filter.</w:t>
+        <w:shd w:fill="EAF2FF"/>
+        <w:spacing w:before="80" w:after="60"/>
+        <w:ind w:left="200" w:right="200"/>
+      </w:pPr>
+      <w:r>
+        <w:rPr>
+          <w:rFonts w:ascii="Consolas" w:hAnsi="Consolas"/>
+          <w:color w:val="0B3060"/>
+          <w:sz w:val="19"/>
+        </w:rPr>
+        <w:t>tshark -n -r data/branch-office.pcap -q --export-objects http,outputs/objects</w:t>
       </w:r>
     </w:p>
     <w:p>
@@ -8567,7 +9406,7 @@
           <w:color w:val="1F6FEB"/>
           <w:sz w:val="22"/>
         </w:rPr>
-        <w:t>Reflection</w:t>
+        <w:t>Challenge</w:t>
       </w:r>
     </w:p>
     <w:p>
@@ -8578,44 +9417,7 @@
         <w:rPr>
           <w:b w:val="0"/>
         </w:rPr>
-        <w:t>Which second observation point would strengthen your conclusion?</w:t>
-      </w:r>
-    </w:p>
-    <w:p>
-      <w:r>
-        <w:rPr>
-          <w:b/>
-          <w:color w:val="1F6FEB"/>
-        </w:rPr>
-        <w:t xml:space="preserve">Note: </w:t>
-      </w:r>
-      <w:r>
-        <w:rPr>
-          <w:sz w:val="20"/>
-        </w:rPr>
-        <w:t>Full commands are in labs/lab-16-*/README.md. Use the README in the matching labs/lab-NN-title/ folder. Capture only with permission.</w:t>
-      </w:r>
-    </w:p>
-    <w:p/>
-    <w:p>
-      <w:pPr>
-        <w:pStyle w:val="Heading1"/>
-        <w:keepNext/>
-      </w:pPr>
-      <w:r>
-        <w:t>Topic 17 — TLS-Encrypted Traffic Analysis</w:t>
-      </w:r>
-    </w:p>
-    <w:p>
-      <w:pPr>
-        <w:keepNext/>
-        <w:keepLines/>
-      </w:pPr>
-      <w:r>
-        <w:rPr>
-          <w:b w:val="0"/>
-        </w:rPr>
-        <w:t>Compare encrypted and decrypted views</w:t>
+        <w:t>Develop and explain an alternative filter.</w:t>
       </w:r>
     </w:p>
     <w:p>
@@ -8625,6 +9427,85 @@
           <w:color w:val="1F6FEB"/>
           <w:sz w:val="22"/>
         </w:rPr>
+        <w:t>Reflection</w:t>
+      </w:r>
+    </w:p>
+    <w:p>
+      <w:pPr>
+        <w:keepLines/>
+      </w:pPr>
+      <w:r>
+        <w:rPr>
+          <w:b w:val="0"/>
+        </w:rPr>
+        <w:t>Which second observation point would strengthen your conclusion?</w:t>
+      </w:r>
+    </w:p>
+    <w:p>
+      <w:r>
+        <w:rPr>
+          <w:b/>
+          <w:color w:val="1F6FEB"/>
+          <w:sz w:val="22"/>
+        </w:rPr>
+        <w:t>Extension (optional)</w:t>
+      </w:r>
+    </w:p>
+    <w:p>
+      <w:pPr>
+        <w:keepLines/>
+      </w:pPr>
+      <w:r>
+        <w:rPr>
+          <w:b w:val="0"/>
+        </w:rPr>
+        <w:t>HTTP lab — compare conditional GET (304) behaviour in the HTTP traces. Hash every exported object with shasum -a 256. Source: J.F. Kurose and K.W. Ross, Wireshark Labs (gaia.cs.umass.edu/kurose_ross/wireshark.php).</w:t>
+      </w:r>
+    </w:p>
+    <w:p>
+      <w:r>
+        <w:rPr>
+          <w:b/>
+          <w:color w:val="1F6FEB"/>
+        </w:rPr>
+        <w:t xml:space="preserve">Note: </w:t>
+      </w:r>
+      <w:r>
+        <w:rPr>
+          <w:sz w:val="20"/>
+        </w:rPr>
+        <w:t>Printable copy: labs/lab-16-inspect-http-outcomes-and-http-2-frames/LAB-16-Instructions.pdf. Use the README in the matching labs/lab-NN-title/ folder. Capture only with permission.</w:t>
+      </w:r>
+    </w:p>
+    <w:p/>
+    <w:p>
+      <w:pPr>
+        <w:pStyle w:val="Heading1"/>
+        <w:keepNext/>
+      </w:pPr>
+      <w:r>
+        <w:t>Topic 17 — TLS-Encrypted Traffic Analysis</w:t>
+      </w:r>
+    </w:p>
+    <w:p>
+      <w:pPr>
+        <w:keepNext/>
+        <w:keepLines/>
+      </w:pPr>
+      <w:r>
+        <w:rPr>
+          <w:b w:val="0"/>
+        </w:rPr>
+        <w:t>Compare encrypted and decrypted views</w:t>
+      </w:r>
+    </w:p>
+    <w:p>
+      <w:r>
+        <w:rPr>
+          <w:b/>
+          <w:color w:val="1F6FEB"/>
+          <w:sz w:val="22"/>
+        </w:rPr>
         <w:t>Key concepts</w:t>
       </w:r>
     </w:p>
@@ -8650,6 +9531,58 @@
       </w:pPr>
       <w:r>
         <w:t>A server RSA private key alone cannot decrypt modern ECDHE or TLS 1.3 sessions.</w:t>
+      </w:r>
+    </w:p>
+    <w:p>
+      <w:pPr>
+        <w:jc w:val="center"/>
+      </w:pPr>
+      <w:r>
+        <w:drawing>
+          <wp:inline xmlns:a="http://schemas.openxmlformats.org/drawingml/2006/main" xmlns:pic="http://schemas.openxmlformats.org/drawingml/2006/picture">
+            <wp:extent cx="5760720" cy="3532231"/>
+            <wp:docPr id="33" name="Picture 33"/>
+            <wp:cNvGraphicFramePr>
+              <a:graphicFrameLocks noChangeAspect="1"/>
+            </wp:cNvGraphicFramePr>
+            <a:graphic>
+              <a:graphicData uri="http://schemas.openxmlformats.org/drawingml/2006/picture">
+                <pic:pic>
+                  <pic:nvPicPr>
+                    <pic:cNvPr id="0" name="ladder-tls.png"/>
+                    <pic:cNvPicPr/>
+                  </pic:nvPicPr>
+                  <pic:blipFill>
+                    <a:blip r:embed="rId40"/>
+                    <a:stretch>
+                      <a:fillRect/>
+                    </a:stretch>
+                  </pic:blipFill>
+                  <pic:spPr>
+                    <a:xfrm>
+                      <a:off x="0" y="0"/>
+                      <a:ext cx="5760720" cy="3532231"/>
+                    </a:xfrm>
+                    <a:prstGeom prst="rect"/>
+                  </pic:spPr>
+                </pic:pic>
+              </a:graphicData>
+            </a:graphic>
+          </wp:inline>
+        </w:drawing>
+      </w:r>
+    </w:p>
+    <w:p>
+      <w:pPr>
+        <w:jc w:val="center"/>
+      </w:pPr>
+      <w:r>
+        <w:rPr>
+          <w:i/>
+          <w:color w:val="555B66"/>
+          <w:sz w:val="18"/>
+        </w:rPr>
+        <w:t>TLS 1.2 Handshake in the Lab Capture — tls-session.pcap, decrypted view</w:t>
       </w:r>
     </w:p>
     <w:p>
@@ -8877,7 +9810,7 @@
         <w:drawing>
           <wp:inline xmlns:a="http://schemas.openxmlformats.org/drawingml/2006/main" xmlns:pic="http://schemas.openxmlformats.org/drawingml/2006/picture">
             <wp:extent cx="5760720" cy="2727870"/>
-            <wp:docPr id="32" name="Picture 32"/>
+            <wp:docPr id="34" name="Picture 34"/>
             <wp:cNvGraphicFramePr>
               <a:graphicFrameLocks noChangeAspect="1"/>
             </wp:cNvGraphicFramePr>
@@ -8889,7 +9822,7 @@
                     <pic:cNvPicPr/>
                   </pic:nvPicPr>
                   <pic:blipFill>
-                    <a:blip r:embed="rId39"/>
+                    <a:blip r:embed="rId41"/>
                     <a:stretch>
                       <a:fillRect/>
                     </a:stretch>
@@ -8949,18 +9882,23 @@
           <w:color w:val="1F6FEB"/>
           <w:sz w:val="22"/>
         </w:rPr>
-        <w:t>Challenge</w:t>
+        <w:t>Try it with TShark</w:t>
       </w:r>
     </w:p>
     <w:p>
       <w:pPr>
         <w:keepLines/>
-      </w:pPr>
-      <w:r>
-        <w:rPr>
-          <w:b w:val="0"/>
-        </w:rPr>
-        <w:t>Develop and explain an alternative filter.</w:t>
+        <w:shd w:fill="EAF2FF"/>
+        <w:spacing w:before="80" w:after="60"/>
+        <w:ind w:left="200" w:right="200"/>
+      </w:pPr>
+      <w:r>
+        <w:rPr>
+          <w:rFonts w:ascii="Consolas" w:hAnsi="Consolas"/>
+          <w:color w:val="0B3060"/>
+          <w:sz w:val="19"/>
+        </w:rPr>
+        <w:t>tshark -n -r data/tls-session.pcap -o tls.keylog_file:data/lab-tls.keys -Y http</w:t>
       </w:r>
     </w:p>
     <w:p>
@@ -8970,7 +9908,7 @@
           <w:color w:val="1F6FEB"/>
           <w:sz w:val="22"/>
         </w:rPr>
-        <w:t>Reflection</w:t>
+        <w:t>Challenge</w:t>
       </w:r>
     </w:p>
     <w:p>
@@ -8981,44 +9919,7 @@
         <w:rPr>
           <w:b w:val="0"/>
         </w:rPr>
-        <w:t>Which second observation point would strengthen your conclusion?</w:t>
-      </w:r>
-    </w:p>
-    <w:p>
-      <w:r>
-        <w:rPr>
-          <w:b/>
-          <w:color w:val="1F6FEB"/>
-        </w:rPr>
-        <w:t xml:space="preserve">Note: </w:t>
-      </w:r>
-      <w:r>
-        <w:rPr>
-          <w:sz w:val="20"/>
-        </w:rPr>
-        <w:t>Full commands are in labs/lab-17-*/README.md. Use the README in the matching labs/lab-NN-title/ folder. Capture only with permission.</w:t>
-      </w:r>
-    </w:p>
-    <w:p/>
-    <w:p>
-      <w:pPr>
-        <w:pStyle w:val="Heading1"/>
-        <w:keepNext/>
-      </w:pPr>
-      <w:r>
-        <w:t>Topic 18 — Ten Troubleshooting Steps and Reporting</w:t>
-      </w:r>
-    </w:p>
-    <w:p>
-      <w:pPr>
-        <w:keepNext/>
-        <w:keepLines/>
-      </w:pPr>
-      <w:r>
-        <w:rPr>
-          <w:b w:val="0"/>
-        </w:rPr>
-        <w:t>Produce an evidence-led incident report</w:t>
+        <w:t>Develop and explain an alternative filter.</w:t>
       </w:r>
     </w:p>
     <w:p>
@@ -9028,6 +9929,85 @@
           <w:color w:val="1F6FEB"/>
           <w:sz w:val="22"/>
         </w:rPr>
+        <w:t>Reflection</w:t>
+      </w:r>
+    </w:p>
+    <w:p>
+      <w:pPr>
+        <w:keepLines/>
+      </w:pPr>
+      <w:r>
+        <w:rPr>
+          <w:b w:val="0"/>
+        </w:rPr>
+        <w:t>Which second observation point would strengthen your conclusion?</w:t>
+      </w:r>
+    </w:p>
+    <w:p>
+      <w:r>
+        <w:rPr>
+          <w:b/>
+          <w:color w:val="1F6FEB"/>
+          <w:sz w:val="22"/>
+        </w:rPr>
+        <w:t>Extension (optional)</w:t>
+      </w:r>
+    </w:p>
+    <w:p>
+      <w:pPr>
+        <w:keepLines/>
+      </w:pPr>
+      <w:r>
+        <w:rPr>
+          <w:b w:val="0"/>
+        </w:rPr>
+        <w:t>TLS lab — identify the handshake records and cipher suite in the TLS trace from the Kurose &amp; Ross labs. Source: J.F. Kurose and K.W. Ross, Wireshark Labs (gaia.cs.umass.edu/kurose_ross/wireshark.php).</w:t>
+      </w:r>
+    </w:p>
+    <w:p>
+      <w:r>
+        <w:rPr>
+          <w:b/>
+          <w:color w:val="1F6FEB"/>
+        </w:rPr>
+        <w:t xml:space="preserve">Note: </w:t>
+      </w:r>
+      <w:r>
+        <w:rPr>
+          <w:sz w:val="20"/>
+        </w:rPr>
+        <w:t>Printable copy: labs/lab-17-compare-encrypted-and-decrypted-views/LAB-17-Instructions.pdf. Use the README in the matching labs/lab-NN-title/ folder. Capture only with permission.</w:t>
+      </w:r>
+    </w:p>
+    <w:p/>
+    <w:p>
+      <w:pPr>
+        <w:pStyle w:val="Heading1"/>
+        <w:keepNext/>
+      </w:pPr>
+      <w:r>
+        <w:t>Topic 18 — Ten Troubleshooting Steps and Reporting</w:t>
+      </w:r>
+    </w:p>
+    <w:p>
+      <w:pPr>
+        <w:keepNext/>
+        <w:keepLines/>
+      </w:pPr>
+      <w:r>
+        <w:rPr>
+          <w:b w:val="0"/>
+        </w:rPr>
+        <w:t>Produce an evidence-led incident report</w:t>
+      </w:r>
+    </w:p>
+    <w:p>
+      <w:r>
+        <w:rPr>
+          <w:b/>
+          <w:color w:val="1F6FEB"/>
+          <w:sz w:val="22"/>
+        </w:rPr>
         <w:t>Key concepts</w:t>
       </w:r>
     </w:p>
@@ -9063,7 +10043,7 @@
         <w:drawing>
           <wp:inline xmlns:a="http://schemas.openxmlformats.org/drawingml/2006/main" xmlns:pic="http://schemas.openxmlformats.org/drawingml/2006/picture">
             <wp:extent cx="5751260" cy="3840480"/>
-            <wp:docPr id="33" name="Picture 33"/>
+            <wp:docPr id="35" name="Picture 35"/>
             <wp:cNvGraphicFramePr>
               <a:graphicFrameLocks noChangeAspect="1"/>
             </wp:cNvGraphicFramePr>
@@ -9075,7 +10055,7 @@
                     <pic:cNvPicPr/>
                   </pic:nvPicPr>
                   <pic:blipFill>
-                    <a:blip r:embed="rId40"/>
+                    <a:blip r:embed="rId42"/>
                     <a:stretch>
                       <a:fillRect/>
                     </a:stretch>
@@ -9332,7 +10312,7 @@
         <w:drawing>
           <wp:inline xmlns:a="http://schemas.openxmlformats.org/drawingml/2006/main" xmlns:pic="http://schemas.openxmlformats.org/drawingml/2006/picture">
             <wp:extent cx="5760720" cy="643845"/>
-            <wp:docPr id="34" name="Picture 34"/>
+            <wp:docPr id="36" name="Picture 36"/>
             <wp:cNvGraphicFramePr>
               <a:graphicFrameLocks noChangeAspect="1"/>
             </wp:cNvGraphicFramePr>
@@ -9344,7 +10324,7 @@
                     <pic:cNvPicPr/>
                   </pic:nvPicPr>
                   <pic:blipFill>
-                    <a:blip r:embed="rId41"/>
+                    <a:blip r:embed="rId43"/>
                     <a:stretch>
                       <a:fillRect/>
                     </a:stretch>
@@ -9404,18 +10384,23 @@
           <w:color w:val="1F6FEB"/>
           <w:sz w:val="22"/>
         </w:rPr>
-        <w:t>Challenge</w:t>
+        <w:t>Try it with TShark</w:t>
       </w:r>
     </w:p>
     <w:p>
       <w:pPr>
         <w:keepLines/>
-      </w:pPr>
-      <w:r>
-        <w:rPr>
-          <w:b w:val="0"/>
-        </w:rPr>
-        <w:t>Develop and explain an alternative filter.</w:t>
+        <w:shd w:fill="EAF2FF"/>
+        <w:spacing w:before="80" w:after="60"/>
+        <w:ind w:left="200" w:right="200"/>
+      </w:pPr>
+      <w:r>
+        <w:rPr>
+          <w:rFonts w:ascii="Consolas" w:hAnsi="Consolas"/>
+          <w:color w:val="0B3060"/>
+          <w:sz w:val="19"/>
+        </w:rPr>
+        <w:t>tshark -n -r data/branch-office.pcap -q -z conv,tcp</w:t>
       </w:r>
     </w:p>
     <w:p>
@@ -9425,7 +10410,7 @@
           <w:color w:val="1F6FEB"/>
           <w:sz w:val="22"/>
         </w:rPr>
-        <w:t>Reflection</w:t>
+        <w:t>Challenge</w:t>
       </w:r>
     </w:p>
     <w:p>
@@ -9436,7 +10421,7 @@
         <w:rPr>
           <w:b w:val="0"/>
         </w:rPr>
-        <w:t>Which second observation point would strengthen your conclusion?</w:t>
+        <w:t>Develop and explain an alternative filter.</w:t>
       </w:r>
     </w:p>
     <w:p>
@@ -9444,6 +10429,48 @@
         <w:rPr>
           <w:b/>
           <w:color w:val="1F6FEB"/>
+          <w:sz w:val="22"/>
+        </w:rPr>
+        <w:t>Reflection</w:t>
+      </w:r>
+    </w:p>
+    <w:p>
+      <w:pPr>
+        <w:keepLines/>
+      </w:pPr>
+      <w:r>
+        <w:rPr>
+          <w:b w:val="0"/>
+        </w:rPr>
+        <w:t>Which second observation point would strengthen your conclusion?</w:t>
+      </w:r>
+    </w:p>
+    <w:p>
+      <w:r>
+        <w:rPr>
+          <w:b/>
+          <w:color w:val="1F6FEB"/>
+          <w:sz w:val="22"/>
+        </w:rPr>
+        <w:t>Extension (optional)</w:t>
+      </w:r>
+    </w:p>
+    <w:p>
+      <w:pPr>
+        <w:keepLines/>
+      </w:pPr>
+      <w:r>
+        <w:rPr>
+          <w:b w:val="0"/>
+        </w:rPr>
+        <w:t>Write a second incident report from a capture in the Wireshark sample captures (wiki.wireshark.org/SampleCaptures), using the same template and checklist.</w:t>
+      </w:r>
+    </w:p>
+    <w:p>
+      <w:r>
+        <w:rPr>
+          <w:b/>
+          <w:color w:val="1F6FEB"/>
         </w:rPr>
         <w:t xml:space="preserve">Note: </w:t>
       </w:r>
@@ -9451,7 +10478,7 @@
         <w:rPr>
           <w:sz w:val="20"/>
         </w:rPr>
-        <w:t>Full commands are in labs/lab-18-*/README.md. Use the README in the matching labs/lab-NN-title/ folder. Capture only with permission.</w:t>
+        <w:t>Printable copy: labs/lab-18-produce-an-evidence-led-incident-report/LAB-18-Instructions.pdf. Use the README in the matching labs/lab-NN-title/ folder. Capture only with permission.</w:t>
       </w:r>
     </w:p>
     <w:p/>
@@ -9494,6 +10521,114 @@
         <w:keepNext/>
       </w:pPr>
       <w:r>
+        <w:t>Further Learning</w:t>
+      </w:r>
+    </w:p>
+    <w:p>
+      <w:pPr>
+        <w:keepLines/>
+      </w:pPr>
+      <w:r>
+        <w:rPr>
+          <w:b w:val="0"/>
+        </w:rPr>
+        <w:t>These sources informed the course content and are recommended for extra practice. Kurose &amp; Ross material is referenced with acknowledgement, as its terms require.</w:t>
+      </w:r>
+    </w:p>
+    <w:p>
+      <w:pPr>
+        <w:pStyle w:val="ListBullet"/>
+      </w:pPr>
+      <w:r>
+        <w:t>Wireshark — Learn — https://www.wireshark.org/learn</w:t>
+      </w:r>
+    </w:p>
+    <w:p>
+      <w:pPr>
+        <w:pStyle w:val="ListBullet"/>
+      </w:pPr>
+      <w:r>
+        <w:t>Kurose &amp; Ross — Wireshark Labs (v9.0) — https://gaia.cs.umass.edu/kurose_ross/wireshark.php</w:t>
+      </w:r>
+    </w:p>
+    <w:p>
+      <w:pPr>
+        <w:pStyle w:val="ListBullet"/>
+      </w:pPr>
+      <w:r>
+        <w:t>UMass — Wireshark lab files — https://gaia.cs.umass.edu/wireshark-labs/</w:t>
+      </w:r>
+    </w:p>
+    <w:p>
+      <w:pPr>
+        <w:pStyle w:val="ListBullet"/>
+      </w:pPr>
+      <w:r>
+        <w:t>Cyber Defence Kit — Wireshark hands-on labs — https://docs.cyberdefencekit.org/wireshark/hands-on-labs.html</w:t>
+      </w:r>
+    </w:p>
+    <w:p>
+      <w:pPr>
+        <w:pStyle w:val="ListBullet"/>
+      </w:pPr>
+      <w:r>
+        <w:t>LabEx — Wireshark tutorials — https://labex.io/tutorials/category/wireshark</w:t>
+      </w:r>
+    </w:p>
+    <w:p>
+      <w:pPr>
+        <w:pStyle w:val="ListBullet"/>
+      </w:pPr>
+      <w:r>
+        <w:t>LabEx — Wireshark skill tree — https://labex.io/classroom/skilltrees/wireshark</w:t>
+      </w:r>
+    </w:p>
+    <w:p>
+      <w:pPr>
+        <w:pStyle w:val="ListBullet"/>
+      </w:pPr>
+      <w:r>
+        <w:t>LabEx — learn-wireshark (GitHub) — https://github.com/labex-labs/learn-wireshark</w:t>
+      </w:r>
+    </w:p>
+    <w:p>
+      <w:pPr>
+        <w:pStyle w:val="ListBullet"/>
+      </w:pPr>
+      <w:r>
+        <w:t>Wireshark.com — Learn — https://wireshark.com/learn/</w:t>
+      </w:r>
+    </w:p>
+    <w:p>
+      <w:pPr>
+        <w:pStyle w:val="ListBullet"/>
+      </w:pPr>
+      <w:r>
+        <w:t>101 Labs — Wireshark WCNA — https://www.101labs.net/courses/101-labs-wireshark-wcna/</w:t>
+      </w:r>
+    </w:p>
+    <w:p>
+      <w:pPr>
+        <w:pStyle w:val="ListBullet"/>
+      </w:pPr>
+      <w:r>
+        <w:t>WPI CS3516 — Wireshark lab 1 — https://web.cs.wpi.edu/~cs3516/b09/wireshark/wire1/</w:t>
+      </w:r>
+    </w:p>
+    <w:p>
+      <w:pPr>
+        <w:pStyle w:val="ListBullet"/>
+      </w:pPr>
+      <w:r>
+        <w:t>Wireshark sample captures — https://wiki.wireshark.org/SampleCaptures</w:t>
+      </w:r>
+    </w:p>
+    <w:p>
+      <w:pPr>
+        <w:pStyle w:val="Heading1"/>
+        <w:keepNext/>
+      </w:pPr>
+      <w:r>
         <w:t>Glossary</w:t>
       </w:r>
     </w:p>
@@ -9610,7 +10745,7 @@
       </w:r>
     </w:p>
     <w:sectPr>
-      <w:footerReference w:type="default" r:id="rId42"/>
+      <w:footerReference w:type="default" r:id="rId44"/>
       <w:pgSz w:w="12240" w:h="15840"/>
       <w:pgMar w:top="1440" w:right="1800" w:bottom="1440" w:left="1800" w:header="720" w:footer="720" w:gutter="0"/>
       <w:cols w:space="720"/>

</xml_diff>